<commit_message>
Refine documentation and synchronization rules for Africa CDC and AUC projects. Update deliverable guidelines to ensure clarity and compliance with eligibility criteria. Enhance folder structure and source of truth files to prevent duplication and maintain alignment across formats. Introduce specific instructions for project-specific build scripts, emphasizing the importance of unique content generation for each application.
</commit_message>
<xml_diff>
--- a/applications/africa-cdc/documents/africa-cdc_word.docx
+++ b/applications/africa-cdc/documents/africa-cdc_word.docx
@@ -4,7 +4,7 @@
   <w:body>
     <w:p>
       <w:pPr>
-        <w:spacing w:after="80" w:before="0" w:line="288" w:lineRule="auto"/>
+        <w:spacing w:after="80" w:line="293" w:lineRule="auto"/>
         <w:jc w:val="center"/>
       </w:pPr>
       <w:r>
@@ -20,23 +20,7 @@
     </w:p>
     <w:p>
       <w:pPr>
-        <w:spacing w:after="240" w:before="0" w:line="288" w:lineRule="auto"/>
-        <w:jc w:val="center"/>
-      </w:pPr>
-      <w:r>
-        <w:rPr>
-          <w:rFonts w:ascii="Calibri" w:hAnsi="Calibri" w:eastAsia="Calibri"/>
-          <w:b w:val="0"/>
-          <w:i w:val="0"/>
-          <w:color w:val="3A4A54"/>
-          <w:sz w:val="22"/>
-        </w:rPr>
-        <w:t>Win-Win Application Pack</w:t>
-      </w:r>
-    </w:p>
-    <w:p>
-      <w:pPr>
-        <w:spacing w:after="80" w:before="0" w:line="288" w:lineRule="auto"/>
+        <w:spacing w:after="80" w:line="293" w:lineRule="auto"/>
         <w:jc w:val="center"/>
       </w:pPr>
       <w:r>
@@ -47,12 +31,12 @@
           <w:color w:val="0A1F2E"/>
           <w:sz w:val="44"/>
         </w:rPr>
-        <w:t>Epidemiology &amp; Informatics Talent for FCHIP</w:t>
+        <w:t>Fellowship Nomination — Surveillance Science for Community Health</w:t>
       </w:r>
     </w:p>
     <w:p>
       <w:pPr>
-        <w:spacing w:after="80" w:before="0" w:line="288" w:lineRule="auto"/>
+        <w:spacing w:after="80" w:line="293" w:lineRule="auto"/>
         <w:jc w:val="center"/>
       </w:pPr>
       <w:r>
@@ -61,14 +45,14 @@
           <w:b/>
           <w:i/>
           <w:color w:val="C45C26"/>
-          <w:sz w:val="24"/>
+          <w:sz w:val="26"/>
         </w:rPr>
-        <w:t>Fully funded fellowship strengthening outbreak intelligence capacity</w:t>
+        <w:t>Professional development that returns outbreak intelligence to FCHIP and Uganda's communities</w:t>
       </w:r>
     </w:p>
     <w:p>
       <w:pPr>
-        <w:spacing w:after="200" w:before="0" w:line="288" w:lineRule="auto"/>
+        <w:spacing w:after="200" w:line="293" w:lineRule="auto"/>
         <w:jc w:val="center"/>
       </w:pPr>
       <w:r>
@@ -84,13 +68,12 @@
     </w:p>
     <w:p>
       <w:pPr>
-        <w:spacing w:before="80" w:after="40"/>
         <w:jc w:val="center"/>
       </w:pPr>
       <w:r>
         <w:drawing>
           <wp:inline xmlns:a="http://schemas.openxmlformats.org/drawingml/2006/main" xmlns:pic="http://schemas.openxmlformats.org/drawingml/2006/picture">
-            <wp:extent cx="5205224" cy="2926079"/>
+            <wp:extent cx="5530551" cy="3108960"/>
             <wp:docPr id="1" name="Picture 1"/>
             <wp:cNvGraphicFramePr>
               <a:graphicFrameLocks noChangeAspect="1"/>
@@ -111,7 +94,7 @@
                   <pic:spPr>
                     <a:xfrm>
                       <a:off x="0" y="0"/>
-                      <a:ext cx="5205224" cy="2926079"/>
+                      <a:ext cx="5530551" cy="3108960"/>
                     </a:xfrm>
                     <a:prstGeom prst="rect"/>
                   </pic:spPr>
@@ -124,7 +107,7 @@
     </w:p>
     <w:p>
       <w:pPr>
-        <w:spacing w:after="200" w:before="40" w:line="288" w:lineRule="auto"/>
+        <w:spacing w:after="200" w:line="293" w:lineRule="auto"/>
         <w:jc w:val="center"/>
       </w:pPr>
       <w:r>
@@ -135,330 +118,28 @@
           <w:color w:val="3A4A54"/>
           <w:sz w:val="18"/>
         </w:rPr>
-        <w:t>FairBanks Community Reach — Health for All — Obulamu eri Bonna · Afya kwa Wote · Oburamu bwa Boona</w:t>
+        <w:t>Health for All — Obulamu eri Bonna · Afya kwa Wote · Oburamu bwa Boona</w:t>
       </w:r>
     </w:p>
-    <w:tbl>
-      <w:tblPr>
-        <w:tblW w:type="auto" w:w="0"/>
-        <w:jc w:val="center"/>
-        <w:tblLook w:firstColumn="1" w:firstRow="1" w:lastColumn="0" w:lastRow="0" w:noHBand="0" w:noVBand="1" w:val="04A0"/>
-      </w:tblPr>
-      <w:tblGrid>
-        <w:gridCol w:w="4896"/>
-        <w:gridCol w:w="4896"/>
-      </w:tblGrid>
-      <w:tr>
-        <w:tc>
-          <w:tcPr>
-            <w:tcW w:type="dxa" w:w="2304"/>
-            <w:shd w:fill="0D6E6E"/>
-            <w:tcBorders>
-              <w:top w:val="single" w:sz="8" w:color="0D6E6E"/>
-              <w:left w:val="single" w:sz="8" w:color="0D6E6E"/>
-              <w:bottom w:val="single" w:sz="8" w:color="0D6E6E"/>
-              <w:right w:val="single" w:sz="8" w:color="0D6E6E"/>
-            </w:tcBorders>
-          </w:tcPr>
-          <w:p>
-            <w:r/>
-            <w:r>
-              <w:rPr>
-                <w:rFonts w:ascii="Calibri" w:hAnsi="Calibri" w:eastAsia="Calibri"/>
-                <w:b/>
-                <w:i w:val="0"/>
-                <w:color w:val="FFFFFF"/>
-                <w:sz w:val="20"/>
-              </w:rPr>
-              <w:t>Item</w:t>
-            </w:r>
-          </w:p>
-        </w:tc>
-        <w:tc>
-          <w:tcPr>
-            <w:tcW w:type="dxa" w:w="6912"/>
-            <w:shd w:fill="0D6E6E"/>
-            <w:tcBorders>
-              <w:top w:val="single" w:sz="8" w:color="0D6E6E"/>
-              <w:left w:val="single" w:sz="8" w:color="0D6E6E"/>
-              <w:bottom w:val="single" w:sz="8" w:color="0D6E6E"/>
-              <w:right w:val="single" w:sz="8" w:color="0D6E6E"/>
-            </w:tcBorders>
-          </w:tcPr>
-          <w:p>
-            <w:r/>
-            <w:r>
-              <w:rPr>
-                <w:rFonts w:ascii="Calibri" w:hAnsi="Calibri" w:eastAsia="Calibri"/>
-                <w:b/>
-                <w:i w:val="0"/>
-                <w:color w:val="FFFFFF"/>
-                <w:sz w:val="20"/>
-              </w:rPr>
-              <w:t>Detail</w:t>
-            </w:r>
-          </w:p>
-        </w:tc>
-      </w:tr>
-      <w:tr>
-        <w:tc>
-          <w:tcPr>
-            <w:tcW w:type="dxa" w:w="2304"/>
-            <w:tcBorders>
-              <w:top w:val="single" w:sz="8" w:color="D0DCDC"/>
-              <w:left w:val="single" w:sz="8" w:color="D0DCDC"/>
-              <w:bottom w:val="single" w:sz="8" w:color="D0DCDC"/>
-              <w:right w:val="single" w:sz="8" w:color="D0DCDC"/>
-            </w:tcBorders>
-          </w:tcPr>
-          <w:p>
-            <w:r/>
-            <w:r>
-              <w:rPr>
-                <w:rFonts w:ascii="Calibri" w:hAnsi="Calibri" w:eastAsia="Calibri"/>
-                <w:b w:val="0"/>
-                <w:i w:val="0"/>
-                <w:color w:val="1E2F38"/>
-                <w:sz w:val="20"/>
-              </w:rPr>
-              <w:t>Applicant</w:t>
-            </w:r>
-          </w:p>
-        </w:tc>
-        <w:tc>
-          <w:tcPr>
-            <w:tcW w:type="dxa" w:w="6912"/>
-            <w:tcBorders>
-              <w:top w:val="single" w:sz="8" w:color="D0DCDC"/>
-              <w:left w:val="single" w:sz="8" w:color="D0DCDC"/>
-              <w:bottom w:val="single" w:sz="8" w:color="D0DCDC"/>
-              <w:right w:val="single" w:sz="8" w:color="D0DCDC"/>
-            </w:tcBorders>
-          </w:tcPr>
-          <w:p>
-            <w:r/>
-            <w:r>
-              <w:rPr>
-                <w:rFonts w:ascii="Calibri" w:hAnsi="Calibri" w:eastAsia="Calibri"/>
-                <w:b w:val="0"/>
-                <w:i w:val="0"/>
-                <w:color w:val="1E2F38"/>
-                <w:sz w:val="20"/>
-              </w:rPr>
-              <w:t>Eligible FairBanks public-health staff (AU citizen, under 35, employed)</w:t>
-            </w:r>
-          </w:p>
-        </w:tc>
-      </w:tr>
-      <w:tr>
-        <w:tc>
-          <w:tcPr>
-            <w:tcW w:type="dxa" w:w="2304"/>
-            <w:shd w:fill="F7F5F0"/>
-            <w:tcBorders>
-              <w:top w:val="single" w:sz="8" w:color="D0DCDC"/>
-              <w:left w:val="single" w:sz="8" w:color="D0DCDC"/>
-              <w:bottom w:val="single" w:sz="8" w:color="D0DCDC"/>
-              <w:right w:val="single" w:sz="8" w:color="D0DCDC"/>
-            </w:tcBorders>
-          </w:tcPr>
-          <w:p>
-            <w:r/>
-            <w:r>
-              <w:rPr>
-                <w:rFonts w:ascii="Calibri" w:hAnsi="Calibri" w:eastAsia="Calibri"/>
-                <w:b w:val="0"/>
-                <w:i w:val="0"/>
-                <w:color w:val="1E2F38"/>
-                <w:sz w:val="20"/>
-              </w:rPr>
-              <w:t>Programme</w:t>
-            </w:r>
-          </w:p>
-        </w:tc>
-        <w:tc>
-          <w:tcPr>
-            <w:tcW w:type="dxa" w:w="6912"/>
-            <w:shd w:fill="F7F5F0"/>
-            <w:tcBorders>
-              <w:top w:val="single" w:sz="8" w:color="D0DCDC"/>
-              <w:left w:val="single" w:sz="8" w:color="D0DCDC"/>
-              <w:bottom w:val="single" w:sz="8" w:color="D0DCDC"/>
-              <w:right w:val="single" w:sz="8" w:color="D0DCDC"/>
-            </w:tcBorders>
-          </w:tcPr>
-          <w:p>
-            <w:r/>
-            <w:r>
-              <w:rPr>
-                <w:rFonts w:ascii="Calibri" w:hAnsi="Calibri" w:eastAsia="Calibri"/>
-                <w:b w:val="0"/>
-                <w:i w:val="0"/>
-                <w:color w:val="1E2F38"/>
-                <w:sz w:val="20"/>
-              </w:rPr>
-              <w:t>Africa CDC African Epidemic Services (AES) Epidemiology Fellowship 2026–2028</w:t>
-            </w:r>
-          </w:p>
-        </w:tc>
-      </w:tr>
-      <w:tr>
-        <w:tc>
-          <w:tcPr>
-            <w:tcW w:type="dxa" w:w="2304"/>
-            <w:tcBorders>
-              <w:top w:val="single" w:sz="8" w:color="D0DCDC"/>
-              <w:left w:val="single" w:sz="8" w:color="D0DCDC"/>
-              <w:bottom w:val="single" w:sz="8" w:color="D0DCDC"/>
-              <w:right w:val="single" w:sz="8" w:color="D0DCDC"/>
-            </w:tcBorders>
-          </w:tcPr>
-          <w:p>
-            <w:r/>
-            <w:r>
-              <w:rPr>
-                <w:rFonts w:ascii="Calibri" w:hAnsi="Calibri" w:eastAsia="Calibri"/>
-                <w:b w:val="0"/>
-                <w:i w:val="0"/>
-                <w:color w:val="1E2F38"/>
-                <w:sz w:val="20"/>
-              </w:rPr>
-              <w:t>Deadline</w:t>
-            </w:r>
-          </w:p>
-        </w:tc>
-        <w:tc>
-          <w:tcPr>
-            <w:tcW w:type="dxa" w:w="6912"/>
-            <w:tcBorders>
-              <w:top w:val="single" w:sz="8" w:color="D0DCDC"/>
-              <w:left w:val="single" w:sz="8" w:color="D0DCDC"/>
-              <w:bottom w:val="single" w:sz="8" w:color="D0DCDC"/>
-              <w:right w:val="single" w:sz="8" w:color="D0DCDC"/>
-            </w:tcBorders>
-          </w:tcPr>
-          <w:p>
-            <w:r/>
-            <w:r>
-              <w:rPr>
-                <w:rFonts w:ascii="Calibri" w:hAnsi="Calibri" w:eastAsia="Calibri"/>
-                <w:b w:val="0"/>
-                <w:i w:val="0"/>
-                <w:color w:val="1E2F38"/>
-                <w:sz w:val="20"/>
-              </w:rPr>
-              <w:t>26 August 2026</w:t>
-            </w:r>
-          </w:p>
-        </w:tc>
-      </w:tr>
-      <w:tr>
-        <w:tc>
-          <w:tcPr>
-            <w:tcW w:type="dxa" w:w="2304"/>
-            <w:shd w:fill="F7F5F0"/>
-            <w:tcBorders>
-              <w:top w:val="single" w:sz="8" w:color="D0DCDC"/>
-              <w:left w:val="single" w:sz="8" w:color="D0DCDC"/>
-              <w:bottom w:val="single" w:sz="8" w:color="D0DCDC"/>
-              <w:right w:val="single" w:sz="8" w:color="D0DCDC"/>
-            </w:tcBorders>
-          </w:tcPr>
-          <w:p>
-            <w:r/>
-            <w:r>
-              <w:rPr>
-                <w:rFonts w:ascii="Calibri" w:hAnsi="Calibri" w:eastAsia="Calibri"/>
-                <w:b w:val="0"/>
-                <w:i w:val="0"/>
-                <w:color w:val="1E2F38"/>
-                <w:sz w:val="20"/>
-              </w:rPr>
-              <w:t>Geography</w:t>
-            </w:r>
-          </w:p>
-        </w:tc>
-        <w:tc>
-          <w:tcPr>
-            <w:tcW w:type="dxa" w:w="6912"/>
-            <w:shd w:fill="F7F5F0"/>
-            <w:tcBorders>
-              <w:top w:val="single" w:sz="8" w:color="D0DCDC"/>
-              <w:left w:val="single" w:sz="8" w:color="D0DCDC"/>
-              <w:bottom w:val="single" w:sz="8" w:color="D0DCDC"/>
-              <w:right w:val="single" w:sz="8" w:color="D0DCDC"/>
-            </w:tcBorders>
-          </w:tcPr>
-          <w:p>
-            <w:r/>
-            <w:r>
-              <w:rPr>
-                <w:rFonts w:ascii="Calibri" w:hAnsi="Calibri" w:eastAsia="Calibri"/>
-                <w:b w:val="0"/>
-                <w:i w:val="0"/>
-                <w:color w:val="1E2F38"/>
-                <w:sz w:val="20"/>
-              </w:rPr>
-              <w:t>Addis Ababa training + field placement · Uganda employer</w:t>
-            </w:r>
-          </w:p>
-        </w:tc>
-      </w:tr>
-      <w:tr>
-        <w:tc>
-          <w:tcPr>
-            <w:tcW w:type="dxa" w:w="2304"/>
-            <w:tcBorders>
-              <w:top w:val="single" w:sz="8" w:color="D0DCDC"/>
-              <w:left w:val="single" w:sz="8" w:color="D0DCDC"/>
-              <w:bottom w:val="single" w:sz="8" w:color="D0DCDC"/>
-              <w:right w:val="single" w:sz="8" w:color="D0DCDC"/>
-            </w:tcBorders>
-          </w:tcPr>
-          <w:p>
-            <w:r/>
-            <w:r>
-              <w:rPr>
-                <w:rFonts w:ascii="Calibri" w:hAnsi="Calibri" w:eastAsia="Calibri"/>
-                <w:b w:val="0"/>
-                <w:i w:val="0"/>
-                <w:color w:val="1E2F38"/>
-                <w:sz w:val="20"/>
-              </w:rPr>
-              <w:t>The ask</w:t>
-            </w:r>
-          </w:p>
-        </w:tc>
-        <w:tc>
-          <w:tcPr>
-            <w:tcW w:type="dxa" w:w="6912"/>
-            <w:tcBorders>
-              <w:top w:val="single" w:sz="8" w:color="D0DCDC"/>
-              <w:left w:val="single" w:sz="8" w:color="D0DCDC"/>
-              <w:bottom w:val="single" w:sz="8" w:color="D0DCDC"/>
-              <w:right w:val="single" w:sz="8" w:color="D0DCDC"/>
-            </w:tcBorders>
-          </w:tcPr>
-          <w:p>
-            <w:r/>
-            <w:r>
-              <w:rPr>
-                <w:rFonts w:ascii="Calibri" w:hAnsi="Calibri" w:eastAsia="Calibri"/>
-                <w:b w:val="0"/>
-                <w:i w:val="0"/>
-                <w:color w:val="1E2F38"/>
-                <w:sz w:val="20"/>
-              </w:rPr>
-              <w:t>Select a FairBanks public-health professional for the AES Epidemiology (or Informatics) track.</w:t>
-            </w:r>
-          </w:p>
-        </w:tc>
-      </w:tr>
-    </w:tbl>
-    <w:p/>
     <w:p>
       <w:pPr>
-        <w:spacing w:after="120" w:before="0" w:line="288" w:lineRule="auto"/>
+        <w:spacing w:after="40" w:line="293" w:lineRule="auto"/>
+        <w:jc w:val="center"/>
+      </w:pPr>
+      <w:r>
+        <w:rPr>
+          <w:rFonts w:ascii="Calibri" w:hAnsi="Calibri" w:eastAsia="Calibri"/>
+          <w:b w:val="0"/>
+          <w:i w:val="0"/>
+          <w:color w:val="3A4A54"/>
+          <w:sz w:val="20"/>
+        </w:rPr>
+        <w:t>3 months training in Addis Ababa · 21 months field placement · fully funded</w:t>
+      </w:r>
+    </w:p>
+    <w:p>
+      <w:pPr>
+        <w:spacing w:after="280" w:line="293" w:lineRule="auto"/>
         <w:jc w:val="center"/>
       </w:pPr>
       <w:r>
@@ -479,7 +160,7 @@
     </w:p>
     <w:p>
       <w:pPr>
-        <w:spacing w:before="280" w:after="100"/>
+        <w:spacing w:before="280" w:after="120"/>
       </w:pPr>
       <w:r>
         <w:rPr>
@@ -487,14 +168,14 @@
           <w:b/>
           <w:i w:val="0"/>
           <w:color w:val="0A1F2E"/>
-          <w:sz w:val="36"/>
+          <w:sz w:val="40"/>
         </w:rPr>
-        <w:t>1. Executive Summary</w:t>
+        <w:t>1. Fellowship purpose</w:t>
       </w:r>
     </w:p>
     <w:p>
       <w:pPr>
-        <w:spacing w:after="160" w:before="0" w:line="288" w:lineRule="auto"/>
+        <w:spacing w:after="160" w:line="293" w:lineRule="auto"/>
         <w:jc w:val="left"/>
       </w:pPr>
       <w:r>
@@ -505,12 +186,12 @@
           <w:color w:val="1E2F38"/>
           <w:sz w:val="22"/>
         </w:rPr>
-        <w:t>Africa CDC's AES fellowship builds outbreak investigation, surveillance, and data-analysis skills over two years — including a Public Health Informatics pathway.</w:t>
+        <w:t>Africa CDC's AES fellowship builds outbreak investigation, surveillance, and data-analysis skills over two years — including a Public Health Informatics track. FairBanks needs this depth to make FCHIP's surveillance claims scientifically sound and operationally useful in real communities.</w:t>
       </w:r>
     </w:p>
     <w:p>
       <w:pPr>
-        <w:spacing w:after="160" w:before="0" w:line="288" w:lineRule="auto"/>
+        <w:spacing w:after="160" w:line="293" w:lineRule="auto"/>
         <w:jc w:val="left"/>
       </w:pPr>
       <w:r>
@@ -521,28 +202,12 @@
           <w:color w:val="1E2F38"/>
           <w:sz w:val="22"/>
         </w:rPr>
-        <w:t>FairBanks needs this depth to make FCHIP's surveillance claims scientifically sound and operationally useful.</w:t>
+        <w:t>We nominate an eligible FairBanks public-health professional (African Union citizen, under 35, employed in public health with degree and three years' experience) for the Epidemiology or Informatics track. Africa CDC gains a fellow already embedded in community health work; FairBanks gains skills that return directly to CHWs, clinics, and partner districts.</w:t>
       </w:r>
     </w:p>
     <w:p>
       <w:pPr>
-        <w:spacing w:after="160" w:before="0" w:line="288" w:lineRule="auto"/>
-        <w:jc w:val="left"/>
-      </w:pPr>
-      <w:r>
-        <w:rPr>
-          <w:rFonts w:ascii="Calibri" w:hAnsi="Calibri" w:eastAsia="Calibri"/>
-          <w:b/>
-          <w:i w:val="0"/>
-          <w:color w:val="1E2F38"/>
-          <w:sz w:val="22"/>
-        </w:rPr>
-        <w:t>Africa CDC gains a fellow employed in a live community health setting who will apply skills immediately.</w:t>
-      </w:r>
-    </w:p>
-    <w:p>
-      <w:pPr>
-        <w:spacing w:before="280" w:after="100"/>
+        <w:spacing w:before="280" w:after="120"/>
       </w:pPr>
       <w:r>
         <w:rPr>
@@ -550,209 +215,19 @@
           <w:b/>
           <w:i w:val="0"/>
           <w:color w:val="0A1F2E"/>
-          <w:sz w:val="36"/>
+          <w:sz w:val="40"/>
         </w:rPr>
-        <w:t>2. Win-Win Value</w:t>
+        <w:t>2. Why surveillance science needs community roots</w:t>
       </w:r>
     </w:p>
     <w:p>
       <w:pPr>
-        <w:spacing w:after="160" w:before="0" w:line="288" w:lineRule="auto"/>
-        <w:jc w:val="left"/>
-      </w:pPr>
-      <w:r>
-        <w:rPr>
-          <w:rFonts w:ascii="Calibri" w:hAnsi="Calibri" w:eastAsia="Calibri"/>
-          <w:b w:val="0"/>
-          <w:i w:val="0"/>
-          <w:color w:val="1E2F38"/>
-          <w:sz w:val="22"/>
-        </w:rPr>
-        <w:t>This application is designed as a true partnership: FairBanks grows capacity and reach; the programme advances its own mission with a grounded African health-tech partner.</w:t>
-      </w:r>
-    </w:p>
-    <w:p>
-      <w:pPr>
-        <w:spacing w:before="180" w:after="100"/>
-      </w:pPr>
-      <w:r>
-        <w:rPr>
-          <w:rFonts w:ascii="Calibri" w:hAnsi="Calibri" w:eastAsia="Calibri"/>
-          <w:b/>
-          <w:i w:val="0"/>
-          <w:color w:val="0D6E6E"/>
-          <w:sz w:val="26"/>
-        </w:rPr>
-        <w:t>2.1 What FairBanks / FCHIP gains</w:t>
-      </w:r>
-    </w:p>
-    <w:p>
-      <w:pPr>
-        <w:pStyle w:val="ListBullet"/>
-        <w:spacing w:after="60"/>
-      </w:pPr>
-      <w:r>
-        <w:rPr>
-          <w:rFonts w:ascii="Calibri" w:hAnsi="Calibri" w:eastAsia="Calibri"/>
-          <w:b w:val="0"/>
-          <w:i w:val="0"/>
-          <w:color w:val="1E2F38"/>
-          <w:sz w:val="22"/>
-        </w:rPr>
-        <w:t>World-class epidemiology / informatics training for staff</w:t>
-      </w:r>
-    </w:p>
-    <w:p>
-      <w:pPr>
-        <w:pStyle w:val="ListBullet"/>
-        <w:spacing w:after="60"/>
-      </w:pPr>
-      <w:r>
-        <w:rPr>
-          <w:rFonts w:ascii="Calibri" w:hAnsi="Calibri" w:eastAsia="Calibri"/>
-          <w:b w:val="0"/>
-          <w:i w:val="0"/>
-          <w:color w:val="1E2F38"/>
-          <w:sz w:val="22"/>
-        </w:rPr>
-        <w:t>Stronger outbreak and surveillance modules inside FCHIP</w:t>
-      </w:r>
-    </w:p>
-    <w:p>
-      <w:pPr>
-        <w:pStyle w:val="ListBullet"/>
-        <w:spacing w:after="60"/>
-      </w:pPr>
-      <w:r>
-        <w:rPr>
-          <w:rFonts w:ascii="Calibri" w:hAnsi="Calibri" w:eastAsia="Calibri"/>
-          <w:b w:val="0"/>
-          <w:i w:val="0"/>
-          <w:color w:val="1E2F38"/>
-          <w:sz w:val="22"/>
-        </w:rPr>
-        <w:t>Stipend, travel, insurance, hardware, and software covered</w:t>
-      </w:r>
-    </w:p>
-    <w:p>
-      <w:pPr>
-        <w:pStyle w:val="ListBullet"/>
-        <w:spacing w:after="60"/>
-      </w:pPr>
-      <w:r>
-        <w:rPr>
-          <w:rFonts w:ascii="Calibri" w:hAnsi="Calibri" w:eastAsia="Calibri"/>
-          <w:b w:val="0"/>
-          <w:i w:val="0"/>
-          <w:color w:val="1E2F38"/>
-          <w:sz w:val="22"/>
-        </w:rPr>
-        <w:t>Continental network across African Epidemic Services</w:t>
-      </w:r>
-    </w:p>
-    <w:p>
-      <w:pPr>
-        <w:spacing w:before="180" w:after="100"/>
-      </w:pPr>
-      <w:r>
-        <w:rPr>
-          <w:rFonts w:ascii="Calibri" w:hAnsi="Calibri" w:eastAsia="Calibri"/>
-          <w:b/>
-          <w:i w:val="0"/>
-          <w:color w:val="0D6E6E"/>
-          <w:sz w:val="26"/>
-        </w:rPr>
-        <w:t>2.2 What the programme / partners gain</w:t>
-      </w:r>
-    </w:p>
-    <w:p>
-      <w:pPr>
-        <w:pStyle w:val="ListBullet"/>
-        <w:spacing w:after="60"/>
-      </w:pPr>
-      <w:r>
-        <w:rPr>
-          <w:rFonts w:ascii="Calibri" w:hAnsi="Calibri" w:eastAsia="Calibri"/>
-          <w:b w:val="0"/>
-          <w:i w:val="0"/>
-          <w:color w:val="1E2F38"/>
-          <w:sz w:val="22"/>
-        </w:rPr>
-        <w:t>Fellow already employed in public-facing community health work</w:t>
-      </w:r>
-    </w:p>
-    <w:p>
-      <w:pPr>
-        <w:pStyle w:val="ListBullet"/>
-        <w:spacing w:after="60"/>
-      </w:pPr>
-      <w:r>
-        <w:rPr>
-          <w:rFonts w:ascii="Calibri" w:hAnsi="Calibri" w:eastAsia="Calibri"/>
-          <w:b w:val="0"/>
-          <w:i w:val="0"/>
-          <w:color w:val="1E2F38"/>
-          <w:sz w:val="22"/>
-        </w:rPr>
-        <w:t>Field placement potential linked to real CHW and facility data flows</w:t>
-      </w:r>
-    </w:p>
-    <w:p>
-      <w:pPr>
-        <w:pStyle w:val="ListBullet"/>
-        <w:spacing w:after="60"/>
-      </w:pPr>
-      <w:r>
-        <w:rPr>
-          <w:rFonts w:ascii="Calibri" w:hAnsi="Calibri" w:eastAsia="Calibri"/>
-          <w:b w:val="0"/>
-          <w:i w:val="0"/>
-          <w:color w:val="1E2F38"/>
-          <w:sz w:val="22"/>
-        </w:rPr>
-        <w:t>Contribution to Africa's epidemic readiness from Uganda</w:t>
-      </w:r>
-    </w:p>
-    <w:p>
-      <w:pPr>
-        <w:pStyle w:val="ListBullet"/>
-        <w:spacing w:after="60"/>
-      </w:pPr>
-      <w:r>
-        <w:rPr>
-          <w:rFonts w:ascii="Calibri" w:hAnsi="Calibri" w:eastAsia="Calibri"/>
-          <w:b w:val="0"/>
-          <w:i w:val="0"/>
-          <w:color w:val="1E2F38"/>
-          <w:sz w:val="22"/>
-        </w:rPr>
-        <w:t>Informatics track alignment with digital community health tools</w:t>
-      </w:r>
-    </w:p>
-    <w:p>
-      <w:pPr>
-        <w:spacing w:before="280" w:after="100"/>
-      </w:pPr>
-      <w:r>
-        <w:rPr>
-          <w:rFonts w:ascii="Calibri" w:hAnsi="Calibri" w:eastAsia="Calibri"/>
-          <w:b/>
-          <w:i w:val="0"/>
-          <w:color w:val="0A1F2E"/>
-          <w:sz w:val="36"/>
-        </w:rPr>
-        <w:t>3. The Problem We Address</w:t>
-      </w:r>
-    </w:p>
-    <w:p>
-      <w:pPr>
-        <w:spacing w:before="80" w:after="40"/>
         <w:jc w:val="center"/>
       </w:pPr>
       <w:r>
         <w:drawing>
           <wp:inline xmlns:a="http://schemas.openxmlformats.org/drawingml/2006/main" xmlns:pic="http://schemas.openxmlformats.org/drawingml/2006/picture">
-            <wp:extent cx="3430225" cy="2286000"/>
+            <wp:extent cx="4665106" cy="3108960"/>
             <wp:docPr id="2" name="Picture 2"/>
             <wp:cNvGraphicFramePr>
               <a:graphicFrameLocks noChangeAspect="1"/>
@@ -761,7 +236,7 @@
               <a:graphicData uri="http://schemas.openxmlformats.org/drawingml/2006/picture">
                 <pic:pic>
                   <pic:nvPicPr>
-                    <pic:cNvPr id="0" name="reactive_clinic_opt.jpg"/>
+                    <pic:cNvPr id="0" name="gis_hotspots_opt.jpg"/>
                     <pic:cNvPicPr/>
                   </pic:nvPicPr>
                   <pic:blipFill>
@@ -773,7 +248,7 @@
                   <pic:spPr>
                     <a:xfrm>
                       <a:off x="0" y="0"/>
-                      <a:ext cx="3430225" cy="2286000"/>
+                      <a:ext cx="4665106" cy="3108960"/>
                     </a:xfrm>
                     <a:prstGeom prst="rect"/>
                   </pic:spPr>
@@ -786,7 +261,7 @@
     </w:p>
     <w:p>
       <w:pPr>
-        <w:spacing w:after="200" w:before="40" w:line="288" w:lineRule="auto"/>
+        <w:spacing w:after="200" w:line="293" w:lineRule="auto"/>
         <w:jc w:val="center"/>
       </w:pPr>
       <w:r>
@@ -797,12 +272,12 @@
           <w:color w:val="3A4A54"/>
           <w:sz w:val="18"/>
         </w:rPr>
-        <w:t>Reactive care waits for sickness before it responds</w:t>
+        <w:t>GIS hotspot mapping — surveillance outputs communities can use</w:t>
       </w:r>
     </w:p>
     <w:p>
       <w:pPr>
-        <w:spacing w:after="160" w:before="0" w:line="288" w:lineRule="auto"/>
+        <w:spacing w:after="160" w:line="293" w:lineRule="auto"/>
         <w:jc w:val="left"/>
       </w:pPr>
       <w:r>
@@ -813,12 +288,12 @@
           <w:color w:val="1E2F38"/>
           <w:sz w:val="22"/>
         </w:rPr>
-        <w:t>Predictive community platforms fail without trained people who understand surveillance science, not only software.</w:t>
+        <w:t>Predictive community platforms fail without trained people who understand surveillance science — not only software. Outbreak signals from Community Health Workers and Village Health Teams only become action when someone can investigate cases, analyse trends, and design informatics pipelines with discipline.</w:t>
       </w:r>
     </w:p>
     <w:p>
       <w:pPr>
-        <w:spacing w:after="160" w:before="0" w:line="288" w:lineRule="auto"/>
+        <w:spacing w:after="160" w:line="293" w:lineRule="auto"/>
         <w:jc w:val="left"/>
       </w:pPr>
       <w:r>
@@ -829,12 +304,12 @@
           <w:color w:val="1E2F38"/>
           <w:sz w:val="22"/>
         </w:rPr>
-        <w:t>Africa needs more young epidemiologists and informaticians grounded in primary care realities.</w:t>
+        <w:t>Africa needs more young epidemiologists and informaticians grounded in primary care realities. FairBanks sits inside that reality: live outreach, maternal and child health, chronic screening, and a growing intelligence layer on the community health cascade.</w:t>
       </w:r>
     </w:p>
     <w:p>
       <w:pPr>
-        <w:spacing w:before="280" w:after="100"/>
+        <w:spacing w:before="280" w:after="120"/>
       </w:pPr>
       <w:r>
         <w:rPr>
@@ -842,20 +317,19 @@
           <w:b/>
           <w:i w:val="0"/>
           <w:color w:val="0A1F2E"/>
-          <w:sz w:val="36"/>
+          <w:sz w:val="40"/>
         </w:rPr>
-        <w:t>4. Our Solution: FCHIP &amp; Community Reach</w:t>
+        <w:t>3. Skills that return to FCHIP</w:t>
       </w:r>
     </w:p>
     <w:p>
       <w:pPr>
-        <w:spacing w:before="80" w:after="40"/>
         <w:jc w:val="center"/>
       </w:pPr>
       <w:r>
         <w:drawing>
           <wp:inline xmlns:a="http://schemas.openxmlformats.org/drawingml/2006/main" xmlns:pic="http://schemas.openxmlformats.org/drawingml/2006/picture">
-            <wp:extent cx="4390688" cy="2926080"/>
+            <wp:extent cx="4665106" cy="3108960"/>
             <wp:docPr id="3" name="Picture 3"/>
             <wp:cNvGraphicFramePr>
               <a:graphicFrameLocks noChangeAspect="1"/>
@@ -876,7 +350,7 @@
                   <pic:spPr>
                     <a:xfrm>
                       <a:off x="0" y="0"/>
-                      <a:ext cx="4390688" cy="2926080"/>
+                      <a:ext cx="4665106" cy="3108960"/>
                     </a:xfrm>
                     <a:prstGeom prst="rect"/>
                   </pic:spPr>
@@ -889,7 +363,7 @@
     </w:p>
     <w:p>
       <w:pPr>
-        <w:spacing w:after="200" w:before="40" w:line="288" w:lineRule="auto"/>
+        <w:spacing w:after="200" w:line="293" w:lineRule="auto"/>
         <w:jc w:val="center"/>
       </w:pPr>
       <w:r>
@@ -905,7 +379,7 @@
     </w:p>
     <w:p>
       <w:pPr>
-        <w:spacing w:after="160" w:before="0" w:line="288" w:lineRule="auto"/>
+        <w:spacing w:after="160" w:line="293" w:lineRule="auto"/>
         <w:jc w:val="left"/>
       </w:pPr>
       <w:r>
@@ -916,12 +390,12 @@
           <w:color w:val="1E2F38"/>
           <w:sz w:val="22"/>
         </w:rPr>
-        <w:t>A FairBanks fellow will complete AES training and bring methods home: case investigation discipline, surveillance analysis, and informatics design for FCHIP alerts.</w:t>
+        <w:t>A FairBanks fellow will complete AES training and bring methods home: standardised community signal → investigation → response workflows; surveillance analysis for fever clusters, maternal risk, and medicine stock-outs; and informatics design that improves CHW data quality.</w:t>
       </w:r>
     </w:p>
     <w:p>
       <w:pPr>
-        <w:spacing w:after="160" w:before="0" w:line="288" w:lineRule="auto"/>
+        <w:spacing w:after="160" w:line="293" w:lineRule="auto"/>
         <w:jc w:val="left"/>
       </w:pPr>
       <w:r>
@@ -932,22 +406,129 @@
           <w:color w:val="1E2F38"/>
           <w:sz w:val="22"/>
         </w:rPr>
-        <w:t>Employer support ensures learning returns to community programmes and partner districts.</w:t>
+        <w:t>Employer support ensures learning returns to Community Reach programmes — not a certificate on a shelf. Supervisors and CHW leads will receive cascade training so Africa CDC's investment multiplies across Kampala catchments and partner sites.</w:t>
       </w:r>
     </w:p>
     <w:p>
       <w:pPr>
-        <w:spacing w:before="180" w:after="100"/>
+        <w:spacing w:before="280" w:after="120"/>
       </w:pPr>
       <w:r>
         <w:rPr>
           <w:rFonts w:ascii="Calibri" w:hAnsi="Calibri" w:eastAsia="Calibri"/>
           <w:b/>
           <w:i w:val="0"/>
-          <w:color w:val="0D6E6E"/>
-          <w:sz w:val="26"/>
+          <w:color w:val="0A1F2E"/>
+          <w:sz w:val="40"/>
         </w:rPr>
-        <w:t>4.1 Deep technology core</w:t>
+        <w:t>4. Priority application areas</w:t>
+      </w:r>
+    </w:p>
+    <w:p>
+      <w:pPr>
+        <w:pStyle w:val="ListBullet"/>
+      </w:pPr>
+      <w:r>
+        <w:rPr>
+          <w:rFonts w:ascii="Calibri" w:hAnsi="Calibri" w:eastAsia="Calibri"/>
+          <w:b w:val="0"/>
+          <w:i w:val="0"/>
+          <w:color w:val="1E2F38"/>
+          <w:sz w:val="22"/>
+        </w:rPr>
+        <w:t>Outbreak workflows: community fever reports trigger structured investigation and pharmacy pre-stocking before surges spread.</w:t>
+      </w:r>
+    </w:p>
+    <w:p>
+      <w:pPr>
+        <w:pStyle w:val="ListBullet"/>
+      </w:pPr>
+      <w:r>
+        <w:rPr>
+          <w:rFonts w:ascii="Calibri" w:hAnsi="Calibri" w:eastAsia="Calibri"/>
+          <w:b w:val="0"/>
+          <w:i w:val="0"/>
+          <w:color w:val="1E2F38"/>
+          <w:sz w:val="22"/>
+        </w:rPr>
+        <w:t>Informatics: validation rules and data-quality pipelines for offline CHW capture feeding FCHIP.</w:t>
+      </w:r>
+    </w:p>
+    <w:p>
+      <w:pPr>
+        <w:pStyle w:val="ListBullet"/>
+      </w:pPr>
+      <w:r>
+        <w:rPr>
+          <w:rFonts w:ascii="Calibri" w:hAnsi="Calibri" w:eastAsia="Calibri"/>
+          <w:b w:val="0"/>
+          <w:i w:val="0"/>
+          <w:color w:val="1E2F38"/>
+          <w:sz w:val="22"/>
+        </w:rPr>
+        <w:t>Training cascade: teach CHW supervisors better data use and early-warning interpretation.</w:t>
+      </w:r>
+    </w:p>
+    <w:p>
+      <w:pPr>
+        <w:spacing w:before="280" w:after="120"/>
+      </w:pPr>
+      <w:r>
+        <w:rPr>
+          <w:rFonts w:ascii="Calibri" w:hAnsi="Calibri" w:eastAsia="Calibri"/>
+          <w:b/>
+          <w:i w:val="0"/>
+          <w:color w:val="0A1F2E"/>
+          <w:sz w:val="40"/>
+        </w:rPr>
+        <w:t>5. Employer commitment</w:t>
+      </w:r>
+    </w:p>
+    <w:p>
+      <w:pPr>
+        <w:spacing w:after="160" w:line="293" w:lineRule="auto"/>
+        <w:jc w:val="left"/>
+      </w:pPr>
+      <w:r>
+        <w:rPr>
+          <w:rFonts w:ascii="Calibri" w:hAnsi="Calibri" w:eastAsia="Calibri"/>
+          <w:b w:val="0"/>
+          <w:i w:val="0"/>
+          <w:color w:val="1E2F38"/>
+          <w:sz w:val="22"/>
+        </w:rPr>
+        <w:t>FairBanks Medical Centre and FairBanks Community Reach will release the fellow for Addis Ababa training, provide a structured field placement linked to outreach and facility data flows, and assign internal mentors for surveillance quality improvement.</w:t>
+      </w:r>
+    </w:p>
+    <w:p>
+      <w:pPr>
+        <w:spacing w:after="160" w:line="293" w:lineRule="auto"/>
+        <w:jc w:val="left"/>
+      </w:pPr>
+      <w:r>
+        <w:rPr>
+          <w:rFonts w:ascii="Calibri" w:hAnsi="Calibri" w:eastAsia="Calibri"/>
+          <w:b w:val="0"/>
+          <w:i w:val="0"/>
+          <w:color w:val="1E2F38"/>
+          <w:sz w:val="22"/>
+        </w:rPr>
+        <w:t>We cover counterpart supervision time, device access for field work, and integration of fellowship outputs into FCHIP modules at no extra cost to Africa CDC beyond the fellowship package.</w:t>
+      </w:r>
+    </w:p>
+    <w:p>
+      <w:pPr>
+        <w:spacing w:before="280" w:after="120"/>
+      </w:pPr>
+      <w:r>
+        <w:rPr>
+          <w:rFonts w:ascii="Calibri" w:hAnsi="Calibri" w:eastAsia="Calibri"/>
+          <w:b/>
+          <w:i w:val="0"/>
+          <w:color w:val="0A1F2E"/>
+          <w:sz w:val="40"/>
+        </w:rPr>
+        <w:t>6. Two-year fellowship pathway</w:t>
       </w:r>
     </w:p>
     <w:tbl>
@@ -963,14 +544,8 @@
       <w:tr>
         <w:tc>
           <w:tcPr>
-            <w:tcW w:type="dxa" w:w="3168"/>
+            <w:tcW w:type="dxa" w:w="2592"/>
             <w:shd w:fill="0D6E6E"/>
-            <w:tcBorders>
-              <w:top w:val="single" w:sz="8" w:color="0D6E6E"/>
-              <w:left w:val="single" w:sz="8" w:color="0D6E6E"/>
-              <w:bottom w:val="single" w:sz="8" w:color="0D6E6E"/>
-              <w:right w:val="single" w:sz="8" w:color="0D6E6E"/>
-            </w:tcBorders>
           </w:tcPr>
           <w:p>
             <w:r/>
@@ -982,20 +557,14 @@
                 <w:color w:val="FFFFFF"/>
                 <w:sz w:val="20"/>
               </w:rPr>
-              <w:t>Technology</w:t>
+              <w:t>Phase</w:t>
             </w:r>
           </w:p>
         </w:tc>
         <w:tc>
           <w:tcPr>
-            <w:tcW w:type="dxa" w:w="6048"/>
+            <w:tcW w:type="dxa" w:w="6624"/>
             <w:shd w:fill="0D6E6E"/>
-            <w:tcBorders>
-              <w:top w:val="single" w:sz="8" w:color="0D6E6E"/>
-              <w:left w:val="single" w:sz="8" w:color="0D6E6E"/>
-              <w:bottom w:val="single" w:sz="8" w:color="0D6E6E"/>
-              <w:right w:val="single" w:sz="8" w:color="0D6E6E"/>
-            </w:tcBorders>
           </w:tcPr>
           <w:p>
             <w:r/>
@@ -1007,7 +576,7 @@
                 <w:color w:val="FFFFFF"/>
                 <w:sz w:val="20"/>
               </w:rPr>
-              <w:t>Role</w:t>
+              <w:t>Activities</w:t>
             </w:r>
           </w:p>
         </w:tc>
@@ -1015,13 +584,7 @@
       <w:tr>
         <w:tc>
           <w:tcPr>
-            <w:tcW w:type="dxa" w:w="3168"/>
-            <w:tcBorders>
-              <w:top w:val="single" w:sz="8" w:color="D0DCDC"/>
-              <w:left w:val="single" w:sz="8" w:color="D0DCDC"/>
-              <w:bottom w:val="single" w:sz="8" w:color="D0DCDC"/>
-              <w:right w:val="single" w:sz="8" w:color="D0DCDC"/>
-            </w:tcBorders>
+            <w:tcW w:type="dxa" w:w="2592"/>
           </w:tcPr>
           <w:p>
             <w:r/>
@@ -1033,19 +596,13 @@
                 <w:color w:val="1E2F38"/>
                 <w:sz w:val="20"/>
               </w:rPr>
-              <w:t>Artificial Intelligence</w:t>
+              <w:t>Months 1–3</w:t>
             </w:r>
           </w:p>
         </w:tc>
         <w:tc>
           <w:tcPr>
-            <w:tcW w:type="dxa" w:w="6048"/>
-            <w:tcBorders>
-              <w:top w:val="single" w:sz="8" w:color="D0DCDC"/>
-              <w:left w:val="single" w:sz="8" w:color="D0DCDC"/>
-              <w:bottom w:val="single" w:sz="8" w:color="D0DCDC"/>
-              <w:right w:val="single" w:sz="8" w:color="D0DCDC"/>
-            </w:tcBorders>
+            <w:tcW w:type="dxa" w:w="6624"/>
           </w:tcPr>
           <w:p>
             <w:r/>
@@ -1057,7 +614,7 @@
                 <w:color w:val="1E2F38"/>
                 <w:sz w:val="20"/>
               </w:rPr>
-              <w:t>Outbreak early warning; maternal and NCD risk scoring</w:t>
+              <w:t>Core epidemiology and informatics training in Addis Ababa</w:t>
             </w:r>
           </w:p>
         </w:tc>
@@ -1065,14 +622,8 @@
       <w:tr>
         <w:tc>
           <w:tcPr>
-            <w:tcW w:type="dxa" w:w="3168"/>
+            <w:tcW w:type="dxa" w:w="2592"/>
             <w:shd w:fill="F7F5F0"/>
-            <w:tcBorders>
-              <w:top w:val="single" w:sz="8" w:color="D0DCDC"/>
-              <w:left w:val="single" w:sz="8" w:color="D0DCDC"/>
-              <w:bottom w:val="single" w:sz="8" w:color="D0DCDC"/>
-              <w:right w:val="single" w:sz="8" w:color="D0DCDC"/>
-            </w:tcBorders>
           </w:tcPr>
           <w:p>
             <w:r/>
@@ -1084,20 +635,14 @@
                 <w:color w:val="1E2F38"/>
                 <w:sz w:val="20"/>
               </w:rPr>
-              <w:t>Machine Learning</w:t>
+              <w:t>Months 4–12</w:t>
             </w:r>
           </w:p>
         </w:tc>
         <w:tc>
           <w:tcPr>
-            <w:tcW w:type="dxa" w:w="6048"/>
+            <w:tcW w:type="dxa" w:w="6624"/>
             <w:shd w:fill="F7F5F0"/>
-            <w:tcBorders>
-              <w:top w:val="single" w:sz="8" w:color="D0DCDC"/>
-              <w:left w:val="single" w:sz="8" w:color="D0DCDC"/>
-              <w:bottom w:val="single" w:sz="8" w:color="D0DCDC"/>
-              <w:right w:val="single" w:sz="8" w:color="D0DCDC"/>
-            </w:tcBorders>
           </w:tcPr>
           <w:p>
             <w:r/>
@@ -1109,7 +654,7 @@
                 <w:color w:val="1E2F38"/>
                 <w:sz w:val="20"/>
               </w:rPr>
-              <w:t>Learn from community patterns, seasons, and outreach outcomes</w:t>
+              <w:t>Field placement — outbreak workflows and CHW data quality at FairBanks sites</w:t>
             </w:r>
           </w:p>
         </w:tc>
@@ -1117,13 +662,7 @@
       <w:tr>
         <w:tc>
           <w:tcPr>
-            <w:tcW w:type="dxa" w:w="3168"/>
-            <w:tcBorders>
-              <w:top w:val="single" w:sz="8" w:color="D0DCDC"/>
-              <w:left w:val="single" w:sz="8" w:color="D0DCDC"/>
-              <w:bottom w:val="single" w:sz="8" w:color="D0DCDC"/>
-              <w:right w:val="single" w:sz="8" w:color="D0DCDC"/>
-            </w:tcBorders>
+            <w:tcW w:type="dxa" w:w="2592"/>
           </w:tcPr>
           <w:p>
             <w:r/>
@@ -1135,19 +674,13 @@
                 <w:color w:val="1E2F38"/>
                 <w:sz w:val="20"/>
               </w:rPr>
-              <w:t>GIS Mapping</w:t>
+              <w:t>Months 13–24</w:t>
             </w:r>
           </w:p>
         </w:tc>
         <w:tc>
           <w:tcPr>
-            <w:tcW w:type="dxa" w:w="6048"/>
-            <w:tcBorders>
-              <w:top w:val="single" w:sz="8" w:color="D0DCDC"/>
-              <w:left w:val="single" w:sz="8" w:color="D0DCDC"/>
-              <w:bottom w:val="single" w:sz="8" w:color="D0DCDC"/>
-              <w:right w:val="single" w:sz="8" w:color="D0DCDC"/>
-            </w:tcBorders>
+            <w:tcW w:type="dxa" w:w="6624"/>
           </w:tcPr>
           <w:p>
             <w:r/>
@@ -1159,7 +692,7 @@
                 <w:color w:val="1E2F38"/>
                 <w:sz w:val="20"/>
               </w:rPr>
-              <w:t>Disease distribution, hotspots, and resource gaps</w:t>
+              <w:t>Advanced surveillance modules; district partner engagement; FCHIP alert validation</w:t>
             </w:r>
           </w:p>
         </w:tc>
@@ -1167,14 +700,8 @@
       <w:tr>
         <w:tc>
           <w:tcPr>
-            <w:tcW w:type="dxa" w:w="3168"/>
+            <w:tcW w:type="dxa" w:w="2592"/>
             <w:shd w:fill="F7F5F0"/>
-            <w:tcBorders>
-              <w:top w:val="single" w:sz="8" w:color="D0DCDC"/>
-              <w:left w:val="single" w:sz="8" w:color="D0DCDC"/>
-              <w:bottom w:val="single" w:sz="8" w:color="D0DCDC"/>
-              <w:right w:val="single" w:sz="8" w:color="D0DCDC"/>
-            </w:tcBorders>
           </w:tcPr>
           <w:p>
             <w:r/>
@@ -1186,20 +713,14 @@
                 <w:color w:val="1E2F38"/>
                 <w:sz w:val="20"/>
               </w:rPr>
-              <w:t>Mobile Data Collection</w:t>
+              <w:t>Throughout</w:t>
             </w:r>
           </w:p>
         </w:tc>
         <w:tc>
           <w:tcPr>
-            <w:tcW w:type="dxa" w:w="6048"/>
+            <w:tcW w:type="dxa" w:w="6624"/>
             <w:shd w:fill="F7F5F0"/>
-            <w:tcBorders>
-              <w:top w:val="single" w:sz="8" w:color="D0DCDC"/>
-              <w:left w:val="single" w:sz="8" w:color="D0DCDC"/>
-              <w:bottom w:val="single" w:sz="8" w:color="D0DCDC"/>
-              <w:right w:val="single" w:sz="8" w:color="D0DCDC"/>
-            </w:tcBorders>
           </w:tcPr>
           <w:p>
             <w:r/>
@@ -1211,109 +732,7 @@
                 <w:color w:val="1E2F38"/>
                 <w:sz w:val="20"/>
               </w:rPr>
-              <w:t>Offline-capable CHW/VHT capture at household level</w:t>
-            </w:r>
-          </w:p>
-        </w:tc>
-      </w:tr>
-      <w:tr>
-        <w:tc>
-          <w:tcPr>
-            <w:tcW w:type="dxa" w:w="3168"/>
-            <w:tcBorders>
-              <w:top w:val="single" w:sz="8" w:color="D0DCDC"/>
-              <w:left w:val="single" w:sz="8" w:color="D0DCDC"/>
-              <w:bottom w:val="single" w:sz="8" w:color="D0DCDC"/>
-              <w:right w:val="single" w:sz="8" w:color="D0DCDC"/>
-            </w:tcBorders>
-          </w:tcPr>
-          <w:p>
-            <w:r/>
-            <w:r>
-              <w:rPr>
-                <w:rFonts w:ascii="Calibri" w:hAnsi="Calibri" w:eastAsia="Calibri"/>
-                <w:b w:val="0"/>
-                <w:i w:val="0"/>
-                <w:color w:val="1E2F38"/>
-                <w:sz w:val="20"/>
-              </w:rPr>
-              <w:t>Cloud Computing</w:t>
-            </w:r>
-          </w:p>
-        </w:tc>
-        <w:tc>
-          <w:tcPr>
-            <w:tcW w:type="dxa" w:w="6048"/>
-            <w:tcBorders>
-              <w:top w:val="single" w:sz="8" w:color="D0DCDC"/>
-              <w:left w:val="single" w:sz="8" w:color="D0DCDC"/>
-              <w:bottom w:val="single" w:sz="8" w:color="D0DCDC"/>
-              <w:right w:val="single" w:sz="8" w:color="D0DCDC"/>
-            </w:tcBorders>
-          </w:tcPr>
-          <w:p>
-            <w:r/>
-            <w:r>
-              <w:rPr>
-                <w:rFonts w:ascii="Calibri" w:hAnsi="Calibri" w:eastAsia="Calibri"/>
-                <w:b w:val="0"/>
-                <w:i w:val="0"/>
-                <w:color w:val="1E2F38"/>
-                <w:sz w:val="20"/>
-              </w:rPr>
-              <w:t>Secure sync across facilities and partners</w:t>
-            </w:r>
-          </w:p>
-        </w:tc>
-      </w:tr>
-      <w:tr>
-        <w:tc>
-          <w:tcPr>
-            <w:tcW w:type="dxa" w:w="3168"/>
-            <w:shd w:fill="F7F5F0"/>
-            <w:tcBorders>
-              <w:top w:val="single" w:sz="8" w:color="D0DCDC"/>
-              <w:left w:val="single" w:sz="8" w:color="D0DCDC"/>
-              <w:bottom w:val="single" w:sz="8" w:color="D0DCDC"/>
-              <w:right w:val="single" w:sz="8" w:color="D0DCDC"/>
-            </w:tcBorders>
-          </w:tcPr>
-          <w:p>
-            <w:r/>
-            <w:r>
-              <w:rPr>
-                <w:rFonts w:ascii="Calibri" w:hAnsi="Calibri" w:eastAsia="Calibri"/>
-                <w:b w:val="0"/>
-                <w:i w:val="0"/>
-                <w:color w:val="1E2F38"/>
-                <w:sz w:val="20"/>
-              </w:rPr>
-              <w:t>Analytics Dashboards</w:t>
-            </w:r>
-          </w:p>
-        </w:tc>
-        <w:tc>
-          <w:tcPr>
-            <w:tcW w:type="dxa" w:w="6048"/>
-            <w:shd w:fill="F7F5F0"/>
-            <w:tcBorders>
-              <w:top w:val="single" w:sz="8" w:color="D0DCDC"/>
-              <w:left w:val="single" w:sz="8" w:color="D0DCDC"/>
-              <w:bottom w:val="single" w:sz="8" w:color="D0DCDC"/>
-              <w:right w:val="single" w:sz="8" w:color="D0DCDC"/>
-            </w:tcBorders>
-          </w:tcPr>
-          <w:p>
-            <w:r/>
-            <w:r>
-              <w:rPr>
-                <w:rFonts w:ascii="Calibri" w:hAnsi="Calibri" w:eastAsia="Calibri"/>
-                <w:b w:val="0"/>
-                <w:i w:val="0"/>
-                <w:color w:val="1E2F38"/>
-                <w:sz w:val="20"/>
-              </w:rPr>
-              <w:t>Real-time views for clinics, districts, and NGOs</w:t>
+              <w:t>Monthly learning reports; Africa CDC network participation; community feedback loops</w:t>
             </w:r>
           </w:p>
         </w:tc>
@@ -1322,70 +741,7 @@
     <w:p/>
     <w:p>
       <w:pPr>
-        <w:spacing w:before="180" w:after="100"/>
-      </w:pPr>
-      <w:r>
-        <w:rPr>
-          <w:rFonts w:ascii="Calibri" w:hAnsi="Calibri" w:eastAsia="Calibri"/>
-          <w:b/>
-          <w:i w:val="0"/>
-          <w:color w:val="0D6E6E"/>
-          <w:sz w:val="26"/>
-        </w:rPr>
-        <w:t>4.2 Priority use cases for this call</w:t>
-      </w:r>
-    </w:p>
-    <w:p>
-      <w:pPr>
-        <w:spacing w:after="80" w:before="0" w:line="288" w:lineRule="auto"/>
-        <w:jc w:val="left"/>
-      </w:pPr>
-      <w:r>
-        <w:rPr>
-          <w:rFonts w:ascii="Calibri" w:hAnsi="Calibri" w:eastAsia="Calibri"/>
-          <w:b w:val="0"/>
-          <w:i w:val="0"/>
-          <w:color w:val="1E2F38"/>
-          <w:sz w:val="22"/>
-        </w:rPr>
-        <w:t>Outbreak workflows: Standardise community signal → investigation → response.</w:t>
-      </w:r>
-    </w:p>
-    <w:p>
-      <w:pPr>
-        <w:spacing w:after="80" w:before="0" w:line="288" w:lineRule="auto"/>
-        <w:jc w:val="left"/>
-      </w:pPr>
-      <w:r>
-        <w:rPr>
-          <w:rFonts w:ascii="Calibri" w:hAnsi="Calibri" w:eastAsia="Calibri"/>
-          <w:b w:val="0"/>
-          <w:i w:val="0"/>
-          <w:color w:val="1E2F38"/>
-          <w:sz w:val="22"/>
-        </w:rPr>
-        <w:t>Informatics: Improve data quality pipelines for CHW capture.</w:t>
-      </w:r>
-    </w:p>
-    <w:p>
-      <w:pPr>
-        <w:spacing w:after="80" w:before="0" w:line="288" w:lineRule="auto"/>
-        <w:jc w:val="left"/>
-      </w:pPr>
-      <w:r>
-        <w:rPr>
-          <w:rFonts w:ascii="Calibri" w:hAnsi="Calibri" w:eastAsia="Calibri"/>
-          <w:b w:val="0"/>
-          <w:i w:val="0"/>
-          <w:color w:val="1E2F38"/>
-          <w:sz w:val="22"/>
-        </w:rPr>
-        <w:t>Training cascade: Teach CHW supervisors better data use.</w:t>
-      </w:r>
-    </w:p>
-    <w:p>
-      <w:pPr>
-        <w:spacing w:before="280" w:after="100"/>
+        <w:spacing w:before="280" w:after="120"/>
       </w:pPr>
       <w:r>
         <w:rPr>
@@ -1393,9 +749,9 @@
           <w:b/>
           <w:i w:val="0"/>
           <w:color w:val="0A1F2E"/>
-          <w:sz w:val="36"/>
+          <w:sz w:val="40"/>
         </w:rPr>
-        <w:t>5. Fit to Programme Criteria</w:t>
+        <w:t>7. Fit to AES fellowship criteria</w:t>
       </w:r>
     </w:p>
     <w:tbl>
@@ -1413,12 +769,6 @@
           <w:tcPr>
             <w:tcW w:type="dxa" w:w="3456"/>
             <w:shd w:fill="0D6E6E"/>
-            <w:tcBorders>
-              <w:top w:val="single" w:sz="8" w:color="0D6E6E"/>
-              <w:left w:val="single" w:sz="8" w:color="0D6E6E"/>
-              <w:bottom w:val="single" w:sz="8" w:color="0D6E6E"/>
-              <w:right w:val="single" w:sz="8" w:color="0D6E6E"/>
-            </w:tcBorders>
           </w:tcPr>
           <w:p>
             <w:r/>
@@ -1430,7 +780,7 @@
                 <w:color w:val="FFFFFF"/>
                 <w:sz w:val="20"/>
               </w:rPr>
-              <w:t>Criterion / theme</w:t>
+              <w:t>Criterion</w:t>
             </w:r>
           </w:p>
         </w:tc>
@@ -1438,12 +788,6 @@
           <w:tcPr>
             <w:tcW w:type="dxa" w:w="5760"/>
             <w:shd w:fill="0D6E6E"/>
-            <w:tcBorders>
-              <w:top w:val="single" w:sz="8" w:color="0D6E6E"/>
-              <w:left w:val="single" w:sz="8" w:color="0D6E6E"/>
-              <w:bottom w:val="single" w:sz="8" w:color="0D6E6E"/>
-              <w:right w:val="single" w:sz="8" w:color="0D6E6E"/>
-            </w:tcBorders>
           </w:tcPr>
           <w:p>
             <w:r/>
@@ -1455,7 +799,7 @@
                 <w:color w:val="FFFFFF"/>
                 <w:sz w:val="20"/>
               </w:rPr>
-              <w:t>How we respond</w:t>
+              <w:t>How FairBanks responds</w:t>
             </w:r>
           </w:p>
         </w:tc>
@@ -1464,12 +808,6 @@
         <w:tc>
           <w:tcPr>
             <w:tcW w:type="dxa" w:w="3456"/>
-            <w:tcBorders>
-              <w:top w:val="single" w:sz="8" w:color="D0DCDC"/>
-              <w:left w:val="single" w:sz="8" w:color="D0DCDC"/>
-              <w:bottom w:val="single" w:sz="8" w:color="D0DCDC"/>
-              <w:right w:val="single" w:sz="8" w:color="D0DCDC"/>
-            </w:tcBorders>
           </w:tcPr>
           <w:p>
             <w:r/>
@@ -1488,12 +826,6 @@
         <w:tc>
           <w:tcPr>
             <w:tcW w:type="dxa" w:w="5760"/>
-            <w:tcBorders>
-              <w:top w:val="single" w:sz="8" w:color="D0DCDC"/>
-              <w:left w:val="single" w:sz="8" w:color="D0DCDC"/>
-              <w:bottom w:val="single" w:sz="8" w:color="D0DCDC"/>
-              <w:right w:val="single" w:sz="8" w:color="D0DCDC"/>
-            </w:tcBorders>
           </w:tcPr>
           <w:p>
             <w:r/>
@@ -1505,7 +837,7 @@
                 <w:color w:val="1E2F38"/>
                 <w:sz w:val="20"/>
               </w:rPr>
-              <w:t>Ugandan staff candidate in range</w:t>
+              <w:t>Ugandan staff candidate within eligibility range</w:t>
             </w:r>
           </w:p>
         </w:tc>
@@ -1515,12 +847,6 @@
           <w:tcPr>
             <w:tcW w:type="dxa" w:w="3456"/>
             <w:shd w:fill="F7F5F0"/>
-            <w:tcBorders>
-              <w:top w:val="single" w:sz="8" w:color="D0DCDC"/>
-              <w:left w:val="single" w:sz="8" w:color="D0DCDC"/>
-              <w:bottom w:val="single" w:sz="8" w:color="D0DCDC"/>
-              <w:right w:val="single" w:sz="8" w:color="D0DCDC"/>
-            </w:tcBorders>
           </w:tcPr>
           <w:p>
             <w:r/>
@@ -1540,12 +866,6 @@
           <w:tcPr>
             <w:tcW w:type="dxa" w:w="5760"/>
             <w:shd w:fill="F7F5F0"/>
-            <w:tcBorders>
-              <w:top w:val="single" w:sz="8" w:color="D0DCDC"/>
-              <w:left w:val="single" w:sz="8" w:color="D0DCDC"/>
-              <w:bottom w:val="single" w:sz="8" w:color="D0DCDC"/>
-              <w:right w:val="single" w:sz="8" w:color="D0DCDC"/>
-            </w:tcBorders>
           </w:tcPr>
           <w:p>
             <w:r/>
@@ -1566,12 +886,6 @@
         <w:tc>
           <w:tcPr>
             <w:tcW w:type="dxa" w:w="3456"/>
-            <w:tcBorders>
-              <w:top w:val="single" w:sz="8" w:color="D0DCDC"/>
-              <w:left w:val="single" w:sz="8" w:color="D0DCDC"/>
-              <w:bottom w:val="single" w:sz="8" w:color="D0DCDC"/>
-              <w:right w:val="single" w:sz="8" w:color="D0DCDC"/>
-            </w:tcBorders>
           </w:tcPr>
           <w:p>
             <w:r/>
@@ -1590,12 +904,6 @@
         <w:tc>
           <w:tcPr>
             <w:tcW w:type="dxa" w:w="5760"/>
-            <w:tcBorders>
-              <w:top w:val="single" w:sz="8" w:color="D0DCDC"/>
-              <w:left w:val="single" w:sz="8" w:color="D0DCDC"/>
-              <w:bottom w:val="single" w:sz="8" w:color="D0DCDC"/>
-              <w:right w:val="single" w:sz="8" w:color="D0DCDC"/>
-            </w:tcBorders>
           </w:tcPr>
           <w:p>
             <w:r/>
@@ -1607,7 +915,7 @@
                 <w:color w:val="1E2F38"/>
                 <w:sz w:val="20"/>
               </w:rPr>
-              <w:t>Candidate will meet stated requirements</w:t>
+              <w:t>Nominee will meet stated requirements</w:t>
             </w:r>
           </w:p>
         </w:tc>
@@ -1617,12 +925,6 @@
           <w:tcPr>
             <w:tcW w:type="dxa" w:w="3456"/>
             <w:shd w:fill="F7F5F0"/>
-            <w:tcBorders>
-              <w:top w:val="single" w:sz="8" w:color="D0DCDC"/>
-              <w:left w:val="single" w:sz="8" w:color="D0DCDC"/>
-              <w:bottom w:val="single" w:sz="8" w:color="D0DCDC"/>
-              <w:right w:val="single" w:sz="8" w:color="D0DCDC"/>
-            </w:tcBorders>
           </w:tcPr>
           <w:p>
             <w:r/>
@@ -1642,12 +944,6 @@
           <w:tcPr>
             <w:tcW w:type="dxa" w:w="5760"/>
             <w:shd w:fill="F7F5F0"/>
-            <w:tcBorders>
-              <w:top w:val="single" w:sz="8" w:color="D0DCDC"/>
-              <w:left w:val="single" w:sz="8" w:color="D0DCDC"/>
-              <w:bottom w:val="single" w:sz="8" w:color="D0DCDC"/>
-              <w:right w:val="single" w:sz="8" w:color="D0DCDC"/>
-            </w:tcBorders>
           </w:tcPr>
           <w:p>
             <w:r/>
@@ -1659,7 +955,7 @@
                 <w:color w:val="1E2F38"/>
                 <w:sz w:val="20"/>
               </w:rPr>
-              <w:t>Direct fit to FCHIP surveillance goals</w:t>
+              <w:t>Direct fit to FCHIP surveillance and data-quality goals</w:t>
             </w:r>
           </w:p>
         </w:tc>
@@ -1668,7 +964,7 @@
     <w:p/>
     <w:p>
       <w:pPr>
-        <w:spacing w:before="280" w:after="100"/>
+        <w:spacing w:before="280" w:after="120"/>
       </w:pPr>
       <w:r>
         <w:rPr>
@@ -1676,20 +972,98 @@
           <w:b/>
           <w:i w:val="0"/>
           <w:color w:val="0A1F2E"/>
-          <w:sz w:val="36"/>
+          <w:sz w:val="40"/>
         </w:rPr>
-        <w:t>6. Why FairBanks Is Ready</w:t>
+        <w:t>8. Mutual value — fellow, Africa CDC, and communities</w:t>
       </w:r>
     </w:p>
     <w:p>
       <w:pPr>
-        <w:spacing w:before="80" w:after="40"/>
+        <w:spacing w:after="160" w:line="293" w:lineRule="auto"/>
+        <w:jc w:val="left"/>
+      </w:pPr>
+      <w:r>
+        <w:rPr>
+          <w:rFonts w:ascii="Calibri" w:hAnsi="Calibri" w:eastAsia="Calibri"/>
+          <w:b/>
+          <w:i w:val="0"/>
+          <w:color w:val="1E2F38"/>
+          <w:sz w:val="22"/>
+        </w:rPr>
+        <w:t>FairBanks / FCHIP gains: World-class epidemiology training; stronger surveillance modules; stipend, travel, insurance, hardware, and software covered; continental AES network access.</w:t>
+      </w:r>
+    </w:p>
+    <w:p>
+      <w:pPr>
+        <w:spacing w:after="160" w:line="293" w:lineRule="auto"/>
+        <w:jc w:val="left"/>
+      </w:pPr>
+      <w:r>
+        <w:rPr>
+          <w:rFonts w:ascii="Calibri" w:hAnsi="Calibri" w:eastAsia="Calibri"/>
+          <w:b/>
+          <w:i w:val="0"/>
+          <w:color w:val="1E2F38"/>
+          <w:sz w:val="22"/>
+        </w:rPr>
+        <w:t>Africa CDC gains: Fellow employed in live community health work; field placement linked to real CHW and facility data; Uganda contribution to Africa's epidemic readiness; informatics track aligned with digital community health tools.</w:t>
+      </w:r>
+    </w:p>
+    <w:p>
+      <w:pPr>
+        <w:spacing w:before="280" w:after="120"/>
+      </w:pPr>
+      <w:r>
+        <w:rPr>
+          <w:rFonts w:ascii="Calibri" w:hAnsi="Calibri" w:eastAsia="Calibri"/>
+          <w:b/>
+          <w:i w:val="0"/>
+          <w:color w:val="0A1F2E"/>
+          <w:sz w:val="40"/>
+        </w:rPr>
+        <w:t>9. Selection ask</w:t>
+      </w:r>
+    </w:p>
+    <w:p>
+      <w:pPr>
+        <w:spacing w:after="160" w:line="293" w:lineRule="auto"/>
+        <w:jc w:val="left"/>
+      </w:pPr>
+      <w:r>
+        <w:rPr>
+          <w:rFonts w:ascii="Calibri" w:hAnsi="Calibri" w:eastAsia="Calibri"/>
+          <w:b w:val="0"/>
+          <w:i w:val="0"/>
+          <w:color w:val="1E2F38"/>
+          <w:sz w:val="22"/>
+        </w:rPr>
+        <w:t>Epidemics are fought with skilled people. FairBanks will back our fellow completely so Africa CDC's investment returns to communities across Uganda.</w:t>
+      </w:r>
+    </w:p>
+    <w:p>
+      <w:pPr>
+        <w:spacing w:after="160" w:line="293" w:lineRule="auto"/>
+        <w:jc w:val="left"/>
+      </w:pPr>
+      <w:r>
+        <w:rPr>
+          <w:rFonts w:ascii="Calibri" w:hAnsi="Calibri" w:eastAsia="Calibri"/>
+          <w:b w:val="0"/>
+          <w:i w:val="0"/>
+          <w:color w:val="1E2F38"/>
+          <w:sz w:val="22"/>
+        </w:rPr>
+        <w:t>We ask for selection into the 2026–2028 AES Epidemiology or Public Health Informatics cohort.</w:t>
+      </w:r>
+    </w:p>
+    <w:p>
+      <w:pPr>
         <w:jc w:val="center"/>
       </w:pPr>
       <w:r>
         <w:drawing>
           <wp:inline xmlns:a="http://schemas.openxmlformats.org/drawingml/2006/main" xmlns:pic="http://schemas.openxmlformats.org/drawingml/2006/picture">
-            <wp:extent cx="4390688" cy="2926080"/>
+            <wp:extent cx="4665106" cy="3108960"/>
             <wp:docPr id="4" name="Picture 4"/>
             <wp:cNvGraphicFramePr>
               <a:graphicFrameLocks noChangeAspect="1"/>
@@ -1698,7 +1072,7 @@
               <a:graphicData uri="http://schemas.openxmlformats.org/drawingml/2006/picture">
                 <pic:pic>
                   <pic:nvPicPr>
-                    <pic:cNvPr id="0" name="outreach_facilitator_canopy_01_opt.jpg"/>
+                    <pic:cNvPr id="0" name="outreach_audience_full_group_01_opt.jpg"/>
                     <pic:cNvPicPr/>
                   </pic:nvPicPr>
                   <pic:blipFill>
@@ -1710,7 +1084,7 @@
                   <pic:spPr>
                     <a:xfrm>
                       <a:off x="0" y="0"/>
-                      <a:ext cx="4390688" cy="2926080"/>
+                      <a:ext cx="4665106" cy="3108960"/>
                     </a:xfrm>
                     <a:prstGeom prst="rect"/>
                   </pic:spPr>
@@ -1723,7 +1097,7 @@
     </w:p>
     <w:p>
       <w:pPr>
-        <w:spacing w:after="200" w:before="40" w:line="288" w:lineRule="auto"/>
+        <w:spacing w:after="200" w:line="293" w:lineRule="auto"/>
         <w:jc w:val="center"/>
       </w:pPr>
       <w:r>
@@ -1734,725 +1108,12 @@
           <w:color w:val="3A4A54"/>
           <w:sz w:val="18"/>
         </w:rPr>
-        <w:t>Live outreach in Kampala-area communities</w:t>
+        <w:t>Skills that return to CHWs, clinics, and partner districts</w:t>
       </w:r>
     </w:p>
     <w:p>
       <w:pPr>
-        <w:pStyle w:val="ListBullet"/>
-        <w:spacing w:after="60"/>
-      </w:pPr>
-      <w:r>
-        <w:rPr>
-          <w:rFonts w:ascii="Calibri" w:hAnsi="Calibri" w:eastAsia="Calibri"/>
-          <w:b w:val="0"/>
-          <w:i w:val="0"/>
-          <w:color w:val="1E2F38"/>
-          <w:sz w:val="22"/>
-        </w:rPr>
-        <w:t>Functioning FairBanks Medical Centre with clinic, pharmacy, and diagnostics</w:t>
-      </w:r>
-    </w:p>
-    <w:p>
-      <w:pPr>
-        <w:pStyle w:val="ListBullet"/>
-        <w:spacing w:after="60"/>
-      </w:pPr>
-      <w:r>
-        <w:rPr>
-          <w:rFonts w:ascii="Calibri" w:hAnsi="Calibri" w:eastAsia="Calibri"/>
-          <w:b w:val="0"/>
-          <w:i w:val="0"/>
-          <w:color w:val="1E2F38"/>
-          <w:sz w:val="22"/>
-        </w:rPr>
-        <w:t>Active Community Reach outreach in Bukoto, Kyebando, Kisaasi, Kamwokya, Kikaaya</w:t>
-      </w:r>
-    </w:p>
-    <w:p>
-      <w:pPr>
-        <w:pStyle w:val="ListBullet"/>
-        <w:spacing w:after="60"/>
-      </w:pPr>
-      <w:r>
-        <w:rPr>
-          <w:rFonts w:ascii="Calibri" w:hAnsi="Calibri" w:eastAsia="Calibri"/>
-          <w:b w:val="0"/>
-          <w:i w:val="0"/>
-          <w:color w:val="1E2F38"/>
-          <w:sz w:val="22"/>
-        </w:rPr>
-        <w:t>Trusted CHW and VHT relationships for household visits and referrals</w:t>
-      </w:r>
-    </w:p>
-    <w:p>
-      <w:pPr>
-        <w:pStyle w:val="ListBullet"/>
-        <w:spacing w:after="60"/>
-      </w:pPr>
-      <w:r>
-        <w:rPr>
-          <w:rFonts w:ascii="Calibri" w:hAnsi="Calibri" w:eastAsia="Calibri"/>
-          <w:b w:val="0"/>
-          <w:i w:val="0"/>
-          <w:color w:val="1E2F38"/>
-          <w:sz w:val="22"/>
-        </w:rPr>
-        <w:t>Live programmes: maternal &amp; child health, Gericare, chronic-disease screening</w:t>
-      </w:r>
-    </w:p>
-    <w:p>
-      <w:pPr>
-        <w:pStyle w:val="ListBullet"/>
-        <w:spacing w:after="60"/>
-      </w:pPr>
-      <w:r>
-        <w:rPr>
-          <w:rFonts w:ascii="Calibri" w:hAnsi="Calibri" w:eastAsia="Calibri"/>
-          <w:b w:val="0"/>
-          <w:i w:val="0"/>
-          <w:color w:val="1E2F38"/>
-          <w:sz w:val="22"/>
-        </w:rPr>
-        <w:t>Digital health records and outreach data ready to feed FCHIP</w:t>
-      </w:r>
-    </w:p>
-    <w:p>
-      <w:pPr>
-        <w:pStyle w:val="ListBullet"/>
-        <w:spacing w:after="60"/>
-      </w:pPr>
-      <w:r>
-        <w:rPr>
-          <w:rFonts w:ascii="Calibri" w:hAnsi="Calibri" w:eastAsia="Calibri"/>
-          <w:b w:val="0"/>
-          <w:i w:val="0"/>
-          <w:color w:val="1E2F38"/>
-          <w:sz w:val="22"/>
-        </w:rPr>
-        <w:t>Research and partnership mindset for ethical, evidence-based scale</w:t>
-      </w:r>
-    </w:p>
-    <w:p>
-      <w:pPr>
-        <w:spacing w:before="280" w:after="100"/>
-      </w:pPr>
-      <w:r>
-        <w:rPr>
-          <w:rFonts w:ascii="Calibri" w:hAnsi="Calibri" w:eastAsia="Calibri"/>
-          <w:b/>
-          <w:i w:val="0"/>
-          <w:color w:val="0A1F2E"/>
-          <w:sz w:val="36"/>
-        </w:rPr>
-        <w:t>7. Proposed Plan</w:t>
-      </w:r>
-    </w:p>
-    <w:tbl>
-      <w:tblPr>
-        <w:tblW w:type="auto" w:w="0"/>
-        <w:jc w:val="center"/>
-        <w:tblLook w:firstColumn="1" w:firstRow="1" w:lastColumn="0" w:lastRow="0" w:noHBand="0" w:noVBand="1" w:val="04A0"/>
-      </w:tblPr>
-      <w:tblGrid>
-        <w:gridCol w:w="4896"/>
-        <w:gridCol w:w="4896"/>
-      </w:tblGrid>
-      <w:tr>
-        <w:tc>
-          <w:tcPr>
-            <w:tcW w:type="dxa" w:w="2880"/>
-            <w:shd w:fill="0D6E6E"/>
-            <w:tcBorders>
-              <w:top w:val="single" w:sz="8" w:color="0D6E6E"/>
-              <w:left w:val="single" w:sz="8" w:color="0D6E6E"/>
-              <w:bottom w:val="single" w:sz="8" w:color="0D6E6E"/>
-              <w:right w:val="single" w:sz="8" w:color="0D6E6E"/>
-            </w:tcBorders>
-          </w:tcPr>
-          <w:p>
-            <w:r/>
-            <w:r>
-              <w:rPr>
-                <w:rFonts w:ascii="Calibri" w:hAnsi="Calibri" w:eastAsia="Calibri"/>
-                <w:b/>
-                <w:i w:val="0"/>
-                <w:color w:val="FFFFFF"/>
-                <w:sz w:val="20"/>
-              </w:rPr>
-              <w:t>Phase / step</w:t>
-            </w:r>
-          </w:p>
-        </w:tc>
-        <w:tc>
-          <w:tcPr>
-            <w:tcW w:type="dxa" w:w="6336"/>
-            <w:shd w:fill="0D6E6E"/>
-            <w:tcBorders>
-              <w:top w:val="single" w:sz="8" w:color="0D6E6E"/>
-              <w:left w:val="single" w:sz="8" w:color="0D6E6E"/>
-              <w:bottom w:val="single" w:sz="8" w:color="0D6E6E"/>
-              <w:right w:val="single" w:sz="8" w:color="0D6E6E"/>
-            </w:tcBorders>
-          </w:tcPr>
-          <w:p>
-            <w:r/>
-            <w:r>
-              <w:rPr>
-                <w:rFonts w:ascii="Calibri" w:hAnsi="Calibri" w:eastAsia="Calibri"/>
-                <w:b/>
-                <w:i w:val="0"/>
-                <w:color w:val="FFFFFF"/>
-                <w:sz w:val="20"/>
-              </w:rPr>
-              <w:t>Detail</w:t>
-            </w:r>
-          </w:p>
-        </w:tc>
-      </w:tr>
-      <w:tr>
-        <w:tc>
-          <w:tcPr>
-            <w:tcW w:type="dxa" w:w="2880"/>
-            <w:tcBorders>
-              <w:top w:val="single" w:sz="8" w:color="D0DCDC"/>
-              <w:left w:val="single" w:sz="8" w:color="D0DCDC"/>
-              <w:bottom w:val="single" w:sz="8" w:color="D0DCDC"/>
-              <w:right w:val="single" w:sz="8" w:color="D0DCDC"/>
-            </w:tcBorders>
-          </w:tcPr>
-          <w:p>
-            <w:r/>
-            <w:r>
-              <w:rPr>
-                <w:rFonts w:ascii="Calibri" w:hAnsi="Calibri" w:eastAsia="Calibri"/>
-                <w:b w:val="0"/>
-                <w:i w:val="0"/>
-                <w:color w:val="1E2F38"/>
-                <w:sz w:val="20"/>
-              </w:rPr>
-              <w:t>Months 1–3</w:t>
-            </w:r>
-          </w:p>
-        </w:tc>
-        <w:tc>
-          <w:tcPr>
-            <w:tcW w:type="dxa" w:w="6336"/>
-            <w:tcBorders>
-              <w:top w:val="single" w:sz="8" w:color="D0DCDC"/>
-              <w:left w:val="single" w:sz="8" w:color="D0DCDC"/>
-              <w:bottom w:val="single" w:sz="8" w:color="D0DCDC"/>
-              <w:right w:val="single" w:sz="8" w:color="D0DCDC"/>
-            </w:tcBorders>
-          </w:tcPr>
-          <w:p>
-            <w:r/>
-            <w:r>
-              <w:rPr>
-                <w:rFonts w:ascii="Calibri" w:hAnsi="Calibri" w:eastAsia="Calibri"/>
-                <w:b w:val="0"/>
-                <w:i w:val="0"/>
-                <w:color w:val="1E2F38"/>
-                <w:sz w:val="20"/>
-              </w:rPr>
-              <w:t>Core training in Addis Ababa</w:t>
-            </w:r>
-          </w:p>
-        </w:tc>
-      </w:tr>
-      <w:tr>
-        <w:tc>
-          <w:tcPr>
-            <w:tcW w:type="dxa" w:w="2880"/>
-            <w:shd w:fill="F7F5F0"/>
-            <w:tcBorders>
-              <w:top w:val="single" w:sz="8" w:color="D0DCDC"/>
-              <w:left w:val="single" w:sz="8" w:color="D0DCDC"/>
-              <w:bottom w:val="single" w:sz="8" w:color="D0DCDC"/>
-              <w:right w:val="single" w:sz="8" w:color="D0DCDC"/>
-            </w:tcBorders>
-          </w:tcPr>
-          <w:p>
-            <w:r/>
-            <w:r>
-              <w:rPr>
-                <w:rFonts w:ascii="Calibri" w:hAnsi="Calibri" w:eastAsia="Calibri"/>
-                <w:b w:val="0"/>
-                <w:i w:val="0"/>
-                <w:color w:val="1E2F38"/>
-                <w:sz w:val="20"/>
-              </w:rPr>
-              <w:t>Months 4–24</w:t>
-            </w:r>
-          </w:p>
-        </w:tc>
-        <w:tc>
-          <w:tcPr>
-            <w:tcW w:type="dxa" w:w="6336"/>
-            <w:shd w:fill="F7F5F0"/>
-            <w:tcBorders>
-              <w:top w:val="single" w:sz="8" w:color="D0DCDC"/>
-              <w:left w:val="single" w:sz="8" w:color="D0DCDC"/>
-              <w:bottom w:val="single" w:sz="8" w:color="D0DCDC"/>
-              <w:right w:val="single" w:sz="8" w:color="D0DCDC"/>
-            </w:tcBorders>
-          </w:tcPr>
-          <w:p>
-            <w:r/>
-            <w:r>
-              <w:rPr>
-                <w:rFonts w:ascii="Calibri" w:hAnsi="Calibri" w:eastAsia="Calibri"/>
-                <w:b w:val="0"/>
-                <w:i w:val="0"/>
-                <w:color w:val="1E2F38"/>
-                <w:sz w:val="20"/>
-              </w:rPr>
-              <w:t>Field placement with FairBanks / partner public health sites</w:t>
-            </w:r>
-          </w:p>
-        </w:tc>
-      </w:tr>
-      <w:tr>
-        <w:tc>
-          <w:tcPr>
-            <w:tcW w:type="dxa" w:w="2880"/>
-            <w:tcBorders>
-              <w:top w:val="single" w:sz="8" w:color="D0DCDC"/>
-              <w:left w:val="single" w:sz="8" w:color="D0DCDC"/>
-              <w:bottom w:val="single" w:sz="8" w:color="D0DCDC"/>
-              <w:right w:val="single" w:sz="8" w:color="D0DCDC"/>
-            </w:tcBorders>
-          </w:tcPr>
-          <w:p>
-            <w:r/>
-            <w:r>
-              <w:rPr>
-                <w:rFonts w:ascii="Calibri" w:hAnsi="Calibri" w:eastAsia="Calibri"/>
-                <w:b w:val="0"/>
-                <w:i w:val="0"/>
-                <w:color w:val="1E2F38"/>
-                <w:sz w:val="20"/>
-              </w:rPr>
-              <w:t>Throughout</w:t>
-            </w:r>
-          </w:p>
-        </w:tc>
-        <w:tc>
-          <w:tcPr>
-            <w:tcW w:type="dxa" w:w="6336"/>
-            <w:tcBorders>
-              <w:top w:val="single" w:sz="8" w:color="D0DCDC"/>
-              <w:left w:val="single" w:sz="8" w:color="D0DCDC"/>
-              <w:bottom w:val="single" w:sz="8" w:color="D0DCDC"/>
-              <w:right w:val="single" w:sz="8" w:color="D0DCDC"/>
-            </w:tcBorders>
-          </w:tcPr>
-          <w:p>
-            <w:r/>
-            <w:r>
-              <w:rPr>
-                <w:rFonts w:ascii="Calibri" w:hAnsi="Calibri" w:eastAsia="Calibri"/>
-                <w:b w:val="0"/>
-                <w:i w:val="0"/>
-                <w:color w:val="1E2F38"/>
-                <w:sz w:val="20"/>
-              </w:rPr>
-              <w:t>Apply methods to FCHIP surveillance and quality improvement</w:t>
-            </w:r>
-          </w:p>
-        </w:tc>
-      </w:tr>
-    </w:tbl>
-    <w:p/>
-    <w:p>
-      <w:pPr>
-        <w:spacing w:before="280" w:after="100"/>
-      </w:pPr>
-      <w:r>
-        <w:rPr>
-          <w:rFonts w:ascii="Calibri" w:hAnsi="Calibri" w:eastAsia="Calibri"/>
-          <w:b/>
-          <w:i w:val="0"/>
-          <w:color w:val="0A1F2E"/>
-          <w:sz w:val="36"/>
-        </w:rPr>
-        <w:t>8. Risks &amp; Safeguards</w:t>
-      </w:r>
-    </w:p>
-    <w:tbl>
-      <w:tblPr>
-        <w:tblW w:type="auto" w:w="0"/>
-        <w:jc w:val="center"/>
-        <w:tblLook w:firstColumn="1" w:firstRow="1" w:lastColumn="0" w:lastRow="0" w:noHBand="0" w:noVBand="1" w:val="04A0"/>
-      </w:tblPr>
-      <w:tblGrid>
-        <w:gridCol w:w="4896"/>
-        <w:gridCol w:w="4896"/>
-      </w:tblGrid>
-      <w:tr>
-        <w:tc>
-          <w:tcPr>
-            <w:tcW w:type="dxa" w:w="3456"/>
-            <w:shd w:fill="0D6E6E"/>
-            <w:tcBorders>
-              <w:top w:val="single" w:sz="8" w:color="0D6E6E"/>
-              <w:left w:val="single" w:sz="8" w:color="0D6E6E"/>
-              <w:bottom w:val="single" w:sz="8" w:color="0D6E6E"/>
-              <w:right w:val="single" w:sz="8" w:color="0D6E6E"/>
-            </w:tcBorders>
-          </w:tcPr>
-          <w:p>
-            <w:r/>
-            <w:r>
-              <w:rPr>
-                <w:rFonts w:ascii="Calibri" w:hAnsi="Calibri" w:eastAsia="Calibri"/>
-                <w:b/>
-                <w:i w:val="0"/>
-                <w:color w:val="FFFFFF"/>
-                <w:sz w:val="20"/>
-              </w:rPr>
-              <w:t>Risk</w:t>
-            </w:r>
-          </w:p>
-        </w:tc>
-        <w:tc>
-          <w:tcPr>
-            <w:tcW w:type="dxa" w:w="5760"/>
-            <w:shd w:fill="0D6E6E"/>
-            <w:tcBorders>
-              <w:top w:val="single" w:sz="8" w:color="0D6E6E"/>
-              <w:left w:val="single" w:sz="8" w:color="0D6E6E"/>
-              <w:bottom w:val="single" w:sz="8" w:color="0D6E6E"/>
-              <w:right w:val="single" w:sz="8" w:color="0D6E6E"/>
-            </w:tcBorders>
-          </w:tcPr>
-          <w:p>
-            <w:r/>
-            <w:r>
-              <w:rPr>
-                <w:rFonts w:ascii="Calibri" w:hAnsi="Calibri" w:eastAsia="Calibri"/>
-                <w:b/>
-                <w:i w:val="0"/>
-                <w:color w:val="FFFFFF"/>
-                <w:sz w:val="20"/>
-              </w:rPr>
-              <w:t>Mitigation</w:t>
-            </w:r>
-          </w:p>
-        </w:tc>
-      </w:tr>
-      <w:tr>
-        <w:tc>
-          <w:tcPr>
-            <w:tcW w:type="dxa" w:w="3456"/>
-            <w:tcBorders>
-              <w:top w:val="single" w:sz="8" w:color="D0DCDC"/>
-              <w:left w:val="single" w:sz="8" w:color="D0DCDC"/>
-              <w:bottom w:val="single" w:sz="8" w:color="D0DCDC"/>
-              <w:right w:val="single" w:sz="8" w:color="D0DCDC"/>
-            </w:tcBorders>
-          </w:tcPr>
-          <w:p>
-            <w:r/>
-            <w:r>
-              <w:rPr>
-                <w:rFonts w:ascii="Calibri" w:hAnsi="Calibri" w:eastAsia="Calibri"/>
-                <w:b w:val="0"/>
-                <w:i w:val="0"/>
-                <w:color w:val="1E2F38"/>
-                <w:sz w:val="20"/>
-              </w:rPr>
-              <w:t>Data quality in the field</w:t>
-            </w:r>
-          </w:p>
-        </w:tc>
-        <w:tc>
-          <w:tcPr>
-            <w:tcW w:type="dxa" w:w="5760"/>
-            <w:tcBorders>
-              <w:top w:val="single" w:sz="8" w:color="D0DCDC"/>
-              <w:left w:val="single" w:sz="8" w:color="D0DCDC"/>
-              <w:bottom w:val="single" w:sz="8" w:color="D0DCDC"/>
-              <w:right w:val="single" w:sz="8" w:color="D0DCDC"/>
-            </w:tcBorders>
-          </w:tcPr>
-          <w:p>
-            <w:r/>
-            <w:r>
-              <w:rPr>
-                <w:rFonts w:ascii="Calibri" w:hAnsi="Calibri" w:eastAsia="Calibri"/>
-                <w:b w:val="0"/>
-                <w:i w:val="0"/>
-                <w:color w:val="1E2F38"/>
-                <w:sz w:val="20"/>
-              </w:rPr>
-              <w:t>Structured forms, validation, CHW training and supervision</w:t>
-            </w:r>
-          </w:p>
-        </w:tc>
-      </w:tr>
-      <w:tr>
-        <w:tc>
-          <w:tcPr>
-            <w:tcW w:type="dxa" w:w="3456"/>
-            <w:shd w:fill="F7F5F0"/>
-            <w:tcBorders>
-              <w:top w:val="single" w:sz="8" w:color="D0DCDC"/>
-              <w:left w:val="single" w:sz="8" w:color="D0DCDC"/>
-              <w:bottom w:val="single" w:sz="8" w:color="D0DCDC"/>
-              <w:right w:val="single" w:sz="8" w:color="D0DCDC"/>
-            </w:tcBorders>
-          </w:tcPr>
-          <w:p>
-            <w:r/>
-            <w:r>
-              <w:rPr>
-                <w:rFonts w:ascii="Calibri" w:hAnsi="Calibri" w:eastAsia="Calibri"/>
-                <w:b w:val="0"/>
-                <w:i w:val="0"/>
-                <w:color w:val="1E2F38"/>
-                <w:sz w:val="20"/>
-              </w:rPr>
-              <w:t>Low digital literacy</w:t>
-            </w:r>
-          </w:p>
-        </w:tc>
-        <w:tc>
-          <w:tcPr>
-            <w:tcW w:type="dxa" w:w="5760"/>
-            <w:shd w:fill="F7F5F0"/>
-            <w:tcBorders>
-              <w:top w:val="single" w:sz="8" w:color="D0DCDC"/>
-              <w:left w:val="single" w:sz="8" w:color="D0DCDC"/>
-              <w:bottom w:val="single" w:sz="8" w:color="D0DCDC"/>
-              <w:right w:val="single" w:sz="8" w:color="D0DCDC"/>
-            </w:tcBorders>
-          </w:tcPr>
-          <w:p>
-            <w:r/>
-            <w:r>
-              <w:rPr>
-                <w:rFonts w:ascii="Calibri" w:hAnsi="Calibri" w:eastAsia="Calibri"/>
-                <w:b w:val="0"/>
-                <w:i w:val="0"/>
-                <w:color w:val="1E2F38"/>
-                <w:sz w:val="20"/>
-              </w:rPr>
-              <w:t>Simple offline UX, local-language support, supervised rollout</w:t>
-            </w:r>
-          </w:p>
-        </w:tc>
-      </w:tr>
-      <w:tr>
-        <w:tc>
-          <w:tcPr>
-            <w:tcW w:type="dxa" w:w="3456"/>
-            <w:tcBorders>
-              <w:top w:val="single" w:sz="8" w:color="D0DCDC"/>
-              <w:left w:val="single" w:sz="8" w:color="D0DCDC"/>
-              <w:bottom w:val="single" w:sz="8" w:color="D0DCDC"/>
-              <w:right w:val="single" w:sz="8" w:color="D0DCDC"/>
-            </w:tcBorders>
-          </w:tcPr>
-          <w:p>
-            <w:r/>
-            <w:r>
-              <w:rPr>
-                <w:rFonts w:ascii="Calibri" w:hAnsi="Calibri" w:eastAsia="Calibri"/>
-                <w:b w:val="0"/>
-                <w:i w:val="0"/>
-                <w:color w:val="1E2F38"/>
-                <w:sz w:val="20"/>
-              </w:rPr>
-              <w:t>Privacy and consent</w:t>
-            </w:r>
-          </w:p>
-        </w:tc>
-        <w:tc>
-          <w:tcPr>
-            <w:tcW w:type="dxa" w:w="5760"/>
-            <w:tcBorders>
-              <w:top w:val="single" w:sz="8" w:color="D0DCDC"/>
-              <w:left w:val="single" w:sz="8" w:color="D0DCDC"/>
-              <w:bottom w:val="single" w:sz="8" w:color="D0DCDC"/>
-              <w:right w:val="single" w:sz="8" w:color="D0DCDC"/>
-            </w:tcBorders>
-          </w:tcPr>
-          <w:p>
-            <w:r/>
-            <w:r>
-              <w:rPr>
-                <w:rFonts w:ascii="Calibri" w:hAnsi="Calibri" w:eastAsia="Calibri"/>
-                <w:b w:val="0"/>
-                <w:i w:val="0"/>
-                <w:color w:val="1E2F38"/>
-                <w:sz w:val="20"/>
-              </w:rPr>
-              <w:t>Ethical governance aligned with Uganda data protection rules</w:t>
-            </w:r>
-          </w:p>
-        </w:tc>
-      </w:tr>
-      <w:tr>
-        <w:tc>
-          <w:tcPr>
-            <w:tcW w:type="dxa" w:w="3456"/>
-            <w:shd w:fill="F7F5F0"/>
-            <w:tcBorders>
-              <w:top w:val="single" w:sz="8" w:color="D0DCDC"/>
-              <w:left w:val="single" w:sz="8" w:color="D0DCDC"/>
-              <w:bottom w:val="single" w:sz="8" w:color="D0DCDC"/>
-              <w:right w:val="single" w:sz="8" w:color="D0DCDC"/>
-            </w:tcBorders>
-          </w:tcPr>
-          <w:p>
-            <w:r/>
-            <w:r>
-              <w:rPr>
-                <w:rFonts w:ascii="Calibri" w:hAnsi="Calibri" w:eastAsia="Calibri"/>
-                <w:b w:val="0"/>
-                <w:i w:val="0"/>
-                <w:color w:val="1E2F38"/>
-                <w:sz w:val="20"/>
-              </w:rPr>
-              <w:t>Adoption by partners</w:t>
-            </w:r>
-          </w:p>
-        </w:tc>
-        <w:tc>
-          <w:tcPr>
-            <w:tcW w:type="dxa" w:w="5760"/>
-            <w:shd w:fill="F7F5F0"/>
-            <w:tcBorders>
-              <w:top w:val="single" w:sz="8" w:color="D0DCDC"/>
-              <w:left w:val="single" w:sz="8" w:color="D0DCDC"/>
-              <w:bottom w:val="single" w:sz="8" w:color="D0DCDC"/>
-              <w:right w:val="single" w:sz="8" w:color="D0DCDC"/>
-            </w:tcBorders>
-          </w:tcPr>
-          <w:p>
-            <w:r/>
-            <w:r>
-              <w:rPr>
-                <w:rFonts w:ascii="Calibri" w:hAnsi="Calibri" w:eastAsia="Calibri"/>
-                <w:b w:val="0"/>
-                <w:i w:val="0"/>
-                <w:color w:val="1E2F38"/>
-                <w:sz w:val="20"/>
-              </w:rPr>
-              <w:t>Co-design with CHWs, clinics, and district users from day one</w:t>
-            </w:r>
-          </w:p>
-        </w:tc>
-      </w:tr>
-    </w:tbl>
-    <w:p/>
-    <w:p>
-      <w:pPr>
-        <w:spacing w:before="280" w:after="100"/>
-      </w:pPr>
-      <w:r>
-        <w:rPr>
-          <w:rFonts w:ascii="Calibri" w:hAnsi="Calibri" w:eastAsia="Calibri"/>
-          <w:b/>
-          <w:i w:val="0"/>
-          <w:color w:val="0A1F2E"/>
-          <w:sz w:val="36"/>
-        </w:rPr>
-        <w:t>9. Closing Ask</w:t>
-      </w:r>
-    </w:p>
-    <w:p>
-      <w:pPr>
-        <w:spacing w:before="80" w:after="40"/>
-        <w:jc w:val="center"/>
-      </w:pPr>
-      <w:r>
-        <w:drawing>
-          <wp:inline xmlns:a="http://schemas.openxmlformats.org/drawingml/2006/main" xmlns:pic="http://schemas.openxmlformats.org/drawingml/2006/picture">
-            <wp:extent cx="4390688" cy="2926080"/>
-            <wp:docPr id="5" name="Picture 5"/>
-            <wp:cNvGraphicFramePr>
-              <a:graphicFrameLocks noChangeAspect="1"/>
-            </wp:cNvGraphicFramePr>
-            <a:graphic>
-              <a:graphicData uri="http://schemas.openxmlformats.org/drawingml/2006/picture">
-                <pic:pic>
-                  <pic:nvPicPr>
-                    <pic:cNvPr id="0" name="outreach_audience_full_group_01_opt.jpg"/>
-                    <pic:cNvPicPr/>
-                  </pic:nvPicPr>
-                  <pic:blipFill>
-                    <a:blip r:embed="rId13"/>
-                    <a:stretch>
-                      <a:fillRect/>
-                    </a:stretch>
-                  </pic:blipFill>
-                  <pic:spPr>
-                    <a:xfrm>
-                      <a:off x="0" y="0"/>
-                      <a:ext cx="4390688" cy="2926080"/>
-                    </a:xfrm>
-                    <a:prstGeom prst="rect"/>
-                  </pic:spPr>
-                </pic:pic>
-              </a:graphicData>
-            </a:graphic>
-          </wp:inline>
-        </w:drawing>
-      </w:r>
-    </w:p>
-    <w:p>
-      <w:pPr>
-        <w:spacing w:after="200" w:before="40" w:line="288" w:lineRule="auto"/>
-        <w:jc w:val="center"/>
-      </w:pPr>
-      <w:r>
-        <w:rPr>
-          <w:rFonts w:ascii="Calibri" w:hAnsi="Calibri" w:eastAsia="Calibri"/>
-          <w:b w:val="0"/>
-          <w:i/>
-          <w:color w:val="3A4A54"/>
-          <w:sz w:val="18"/>
-        </w:rPr>
-        <w:t>From community needs to lasting health impact</w:t>
-      </w:r>
-    </w:p>
-    <w:p>
-      <w:pPr>
-        <w:spacing w:after="160" w:before="0" w:line="288" w:lineRule="auto"/>
-        <w:jc w:val="left"/>
-      </w:pPr>
-      <w:r>
-        <w:rPr>
-          <w:rFonts w:ascii="Calibri" w:hAnsi="Calibri" w:eastAsia="Calibri"/>
-          <w:b w:val="0"/>
-          <w:i w:val="0"/>
-          <w:color w:val="1E2F38"/>
-          <w:sz w:val="22"/>
-        </w:rPr>
-        <w:t>Epidemics are fought with skilled people. FairBanks will back our fellow completely so Africa CDC's investment returns to communities.</w:t>
-      </w:r>
-    </w:p>
-    <w:p>
-      <w:pPr>
-        <w:spacing w:after="160" w:before="0" w:line="288" w:lineRule="auto"/>
-        <w:jc w:val="left"/>
-      </w:pPr>
-      <w:r>
-        <w:rPr>
-          <w:rFonts w:ascii="Calibri" w:hAnsi="Calibri" w:eastAsia="Calibri"/>
-          <w:b w:val="0"/>
-          <w:i w:val="0"/>
-          <w:color w:val="1E2F38"/>
-          <w:sz w:val="22"/>
-        </w:rPr>
-        <w:t>We ask for selection into the 2026–2028 AES cohort.</w:t>
-      </w:r>
-    </w:p>
-    <w:p>
-      <w:pPr>
-        <w:spacing w:after="160" w:before="160" w:line="288" w:lineRule="auto"/>
+        <w:spacing w:after="160" w:line="293" w:lineRule="auto"/>
         <w:jc w:val="center"/>
       </w:pPr>
       <w:r>
@@ -2468,7 +1129,7 @@
     </w:p>
     <w:p>
       <w:pPr>
-        <w:spacing w:after="160" w:before="160" w:line="288" w:lineRule="auto"/>
+        <w:spacing w:after="160" w:line="293" w:lineRule="auto"/>
         <w:jc w:val="center"/>
       </w:pPr>
       <w:r>
@@ -2479,7 +1140,7 @@
           <w:color w:val="3A4A54"/>
           <w:sz w:val="16"/>
         </w:rPr>
-        <w:t>Aligned with: https://opportunitiesforyouth.org/2026/07/16/africa-cdc-african-epidemic-services-aes-epidemiology-fellowship-2026-2028-fully-funded-apply-by-26-august-2026/</w:t>
+        <w:t>Source: https://opportunitiesforyouth.org/2026/07/16/africa-cdc-african-epidemic-services-aes-epidemiology-fellowship-2026-2028-fully-funded-apply-by-26-august-2026/</w:t>
       </w:r>
     </w:p>
     <w:sectPr>

</xml_diff>

<commit_message>
Update Africa CDC documentation to include "FairBanks Community Health Intelligence Platform (FCHIP)" in titles and subtitles across Word, PDF, and PowerPoint formats. Adjust formatting for improved readability and consistency, ensuring alignment with project branding and messaging guidelines.
</commit_message>
<xml_diff>
--- a/applications/africa-cdc/documents/africa-cdc_word.docx
+++ b/applications/africa-cdc/documents/africa-cdc_word.docx
@@ -46,6 +46,22 @@
           <w:i/>
           <w:color w:val="C45C26"/>
           <w:sz w:val="26"/>
+        </w:rPr>
+        <w:t>FairBanks Community Health Intelligence Platform (FCHIP)</w:t>
+      </w:r>
+    </w:p>
+    <w:p>
+      <w:pPr>
+        <w:spacing w:after="80" w:line="293" w:lineRule="auto"/>
+        <w:jc w:val="center"/>
+      </w:pPr>
+      <w:r>
+        <w:rPr>
+          <w:rFonts w:ascii="Calibri" w:hAnsi="Calibri" w:eastAsia="Calibri"/>
+          <w:b w:val="0"/>
+          <w:i/>
+          <w:color w:val="3A4A54"/>
+          <w:sz w:val="24"/>
         </w:rPr>
         <w:t>Professional development that returns outbreak intelligence to FCHIP and Uganda's communities</w:t>
       </w:r>

</xml_diff>